<commit_message>
Revert "simulation/paper: bring APA preprint/journal builds up to IEEE polish"
This reverts commit 6dc07b4554a96b3409e47962a3c9556b12b22cd9.
</commit_message>
<xml_diff>
--- a/simulation/paper/split/02_body.docx
+++ b/simulation/paper/split/02_body.docx
@@ -2086,19 +2086,8 @@
         <w:tc>
           <w:tcPr>
             <w:tcW w:type="dxa" w:w="1560"/>
-            <w:tcBorders>
-              <w:top w:val="single" w:sz="4" w:space="0" w:color="000000"/>
-              <w:left w:val="nil" w:sz="4" w:space="0" w:color="000000"/>
-              <w:bottom w:val="single" w:sz="4" w:space="0" w:color="000000"/>
-              <w:right w:val="nil" w:sz="4" w:space="0" w:color="000000"/>
-              <w:insideH w:val="nil" w:sz="4" w:space="0" w:color="000000"/>
-              <w:insideV w:val="nil" w:sz="4" w:space="0" w:color="000000"/>
-            </w:tcBorders>
           </w:tcPr>
           <w:p>
-            <w:pPr>
-              <w:jc w:val="center"/>
-            </w:pPr>
             <w:r>
               <w:rPr>
                 <w:rFonts w:ascii="Times New Roman" w:hAnsi="Times New Roman" w:eastAsia="Times New Roman"/>
@@ -2112,19 +2101,8 @@
         <w:tc>
           <w:tcPr>
             <w:tcW w:type="dxa" w:w="1560"/>
-            <w:tcBorders>
-              <w:top w:val="single" w:sz="4" w:space="0" w:color="000000"/>
-              <w:left w:val="nil" w:sz="4" w:space="0" w:color="000000"/>
-              <w:bottom w:val="single" w:sz="4" w:space="0" w:color="000000"/>
-              <w:right w:val="nil" w:sz="4" w:space="0" w:color="000000"/>
-              <w:insideH w:val="nil" w:sz="4" w:space="0" w:color="000000"/>
-              <w:insideV w:val="nil" w:sz="4" w:space="0" w:color="000000"/>
-            </w:tcBorders>
           </w:tcPr>
           <w:p>
-            <w:pPr>
-              <w:jc w:val="center"/>
-            </w:pPr>
             <w:r>
               <w:rPr>
                 <w:rFonts w:ascii="Times New Roman" w:hAnsi="Times New Roman" w:eastAsia="Times New Roman"/>
@@ -2138,19 +2116,8 @@
         <w:tc>
           <w:tcPr>
             <w:tcW w:type="dxa" w:w="1560"/>
-            <w:tcBorders>
-              <w:top w:val="single" w:sz="4" w:space="0" w:color="000000"/>
-              <w:left w:val="nil" w:sz="4" w:space="0" w:color="000000"/>
-              <w:bottom w:val="single" w:sz="4" w:space="0" w:color="000000"/>
-              <w:right w:val="nil" w:sz="4" w:space="0" w:color="000000"/>
-              <w:insideH w:val="nil" w:sz="4" w:space="0" w:color="000000"/>
-              <w:insideV w:val="nil" w:sz="4" w:space="0" w:color="000000"/>
-            </w:tcBorders>
           </w:tcPr>
           <w:p>
-            <w:pPr>
-              <w:jc w:val="center"/>
-            </w:pPr>
             <w:r>
               <w:rPr>
                 <w:rFonts w:ascii="Times New Roman" w:hAnsi="Times New Roman" w:eastAsia="Times New Roman"/>
@@ -2164,19 +2131,8 @@
         <w:tc>
           <w:tcPr>
             <w:tcW w:type="dxa" w:w="1560"/>
-            <w:tcBorders>
-              <w:top w:val="single" w:sz="4" w:space="0" w:color="000000"/>
-              <w:left w:val="nil" w:sz="4" w:space="0" w:color="000000"/>
-              <w:bottom w:val="single" w:sz="4" w:space="0" w:color="000000"/>
-              <w:right w:val="nil" w:sz="4" w:space="0" w:color="000000"/>
-              <w:insideH w:val="nil" w:sz="4" w:space="0" w:color="000000"/>
-              <w:insideV w:val="nil" w:sz="4" w:space="0" w:color="000000"/>
-            </w:tcBorders>
           </w:tcPr>
           <w:p>
-            <w:pPr>
-              <w:jc w:val="center"/>
-            </w:pPr>
             <w:r>
               <w:rPr>
                 <w:rFonts w:ascii="Times New Roman" w:hAnsi="Times New Roman" w:eastAsia="Times New Roman"/>
@@ -2190,19 +2146,8 @@
         <w:tc>
           <w:tcPr>
             <w:tcW w:type="dxa" w:w="1560"/>
-            <w:tcBorders>
-              <w:top w:val="single" w:sz="4" w:space="0" w:color="000000"/>
-              <w:left w:val="nil" w:sz="4" w:space="0" w:color="000000"/>
-              <w:bottom w:val="single" w:sz="4" w:space="0" w:color="000000"/>
-              <w:right w:val="nil" w:sz="4" w:space="0" w:color="000000"/>
-              <w:insideH w:val="nil" w:sz="4" w:space="0" w:color="000000"/>
-              <w:insideV w:val="nil" w:sz="4" w:space="0" w:color="000000"/>
-            </w:tcBorders>
           </w:tcPr>
           <w:p>
-            <w:pPr>
-              <w:jc w:val="center"/>
-            </w:pPr>
             <w:r>
               <w:rPr>
                 <w:rFonts w:ascii="Times New Roman" w:hAnsi="Times New Roman" w:eastAsia="Times New Roman"/>
@@ -2216,19 +2161,8 @@
         <w:tc>
           <w:tcPr>
             <w:tcW w:type="dxa" w:w="1560"/>
-            <w:tcBorders>
-              <w:top w:val="single" w:sz="4" w:space="0" w:color="000000"/>
-              <w:left w:val="nil" w:sz="4" w:space="0" w:color="000000"/>
-              <w:bottom w:val="single" w:sz="4" w:space="0" w:color="000000"/>
-              <w:right w:val="nil" w:sz="4" w:space="0" w:color="000000"/>
-              <w:insideH w:val="nil" w:sz="4" w:space="0" w:color="000000"/>
-              <w:insideV w:val="nil" w:sz="4" w:space="0" w:color="000000"/>
-            </w:tcBorders>
           </w:tcPr>
           <w:p>
-            <w:pPr>
-              <w:jc w:val="center"/>
-            </w:pPr>
             <w:r>
               <w:rPr>
                 <w:rFonts w:ascii="Times New Roman" w:hAnsi="Times New Roman" w:eastAsia="Times New Roman"/>
@@ -2244,19 +2178,8 @@
         <w:tc>
           <w:tcPr>
             <w:tcW w:type="dxa" w:w="1560"/>
-            <w:tcBorders>
-              <w:top w:val="nil" w:sz="4" w:space="0" w:color="000000"/>
-              <w:left w:val="nil" w:sz="4" w:space="0" w:color="000000"/>
-              <w:bottom w:val="nil" w:sz="4" w:space="0" w:color="000000"/>
-              <w:right w:val="nil" w:sz="4" w:space="0" w:color="000000"/>
-              <w:insideH w:val="nil" w:sz="4" w:space="0" w:color="000000"/>
-              <w:insideV w:val="nil" w:sz="4" w:space="0" w:color="000000"/>
-            </w:tcBorders>
           </w:tcPr>
           <w:p>
-            <w:pPr>
-              <w:jc w:val="left"/>
-            </w:pPr>
             <w:r>
               <w:rPr>
                 <w:rFonts w:ascii="Times New Roman" w:hAnsi="Times New Roman" w:eastAsia="Times New Roman"/>
@@ -2270,19 +2193,8 @@
         <w:tc>
           <w:tcPr>
             <w:tcW w:type="dxa" w:w="1560"/>
-            <w:tcBorders>
-              <w:top w:val="nil" w:sz="4" w:space="0" w:color="000000"/>
-              <w:left w:val="nil" w:sz="4" w:space="0" w:color="000000"/>
-              <w:bottom w:val="nil" w:sz="4" w:space="0" w:color="000000"/>
-              <w:right w:val="nil" w:sz="4" w:space="0" w:color="000000"/>
-              <w:insideH w:val="nil" w:sz="4" w:space="0" w:color="000000"/>
-              <w:insideV w:val="nil" w:sz="4" w:space="0" w:color="000000"/>
-            </w:tcBorders>
           </w:tcPr>
           <w:p>
-            <w:pPr>
-              <w:jc w:val="right"/>
-            </w:pPr>
             <w:r>
               <w:rPr>
                 <w:rFonts w:ascii="Times New Roman" w:hAnsi="Times New Roman" w:eastAsia="Times New Roman"/>
@@ -2296,19 +2208,8 @@
         <w:tc>
           <w:tcPr>
             <w:tcW w:type="dxa" w:w="1560"/>
-            <w:tcBorders>
-              <w:top w:val="nil" w:sz="4" w:space="0" w:color="000000"/>
-              <w:left w:val="nil" w:sz="4" w:space="0" w:color="000000"/>
-              <w:bottom w:val="nil" w:sz="4" w:space="0" w:color="000000"/>
-              <w:right w:val="nil" w:sz="4" w:space="0" w:color="000000"/>
-              <w:insideH w:val="nil" w:sz="4" w:space="0" w:color="000000"/>
-              <w:insideV w:val="nil" w:sz="4" w:space="0" w:color="000000"/>
-            </w:tcBorders>
           </w:tcPr>
           <w:p>
-            <w:pPr>
-              <w:jc w:val="right"/>
-            </w:pPr>
             <w:r>
               <w:rPr>
                 <w:rFonts w:ascii="Times New Roman" w:hAnsi="Times New Roman" w:eastAsia="Times New Roman"/>
@@ -2322,19 +2223,8 @@
         <w:tc>
           <w:tcPr>
             <w:tcW w:type="dxa" w:w="1560"/>
-            <w:tcBorders>
-              <w:top w:val="nil" w:sz="4" w:space="0" w:color="000000"/>
-              <w:left w:val="nil" w:sz="4" w:space="0" w:color="000000"/>
-              <w:bottom w:val="nil" w:sz="4" w:space="0" w:color="000000"/>
-              <w:right w:val="nil" w:sz="4" w:space="0" w:color="000000"/>
-              <w:insideH w:val="nil" w:sz="4" w:space="0" w:color="000000"/>
-              <w:insideV w:val="nil" w:sz="4" w:space="0" w:color="000000"/>
-            </w:tcBorders>
           </w:tcPr>
           <w:p>
-            <w:pPr>
-              <w:jc w:val="right"/>
-            </w:pPr>
             <w:r>
               <w:rPr>
                 <w:rFonts w:ascii="Times New Roman" w:hAnsi="Times New Roman" w:eastAsia="Times New Roman"/>
@@ -2348,19 +2238,8 @@
         <w:tc>
           <w:tcPr>
             <w:tcW w:type="dxa" w:w="1560"/>
-            <w:tcBorders>
-              <w:top w:val="nil" w:sz="4" w:space="0" w:color="000000"/>
-              <w:left w:val="nil" w:sz="4" w:space="0" w:color="000000"/>
-              <w:bottom w:val="nil" w:sz="4" w:space="0" w:color="000000"/>
-              <w:right w:val="nil" w:sz="4" w:space="0" w:color="000000"/>
-              <w:insideH w:val="nil" w:sz="4" w:space="0" w:color="000000"/>
-              <w:insideV w:val="nil" w:sz="4" w:space="0" w:color="000000"/>
-            </w:tcBorders>
           </w:tcPr>
           <w:p>
-            <w:pPr>
-              <w:jc w:val="left"/>
-            </w:pPr>
             <w:r>
               <w:rPr>
                 <w:rFonts w:ascii="Times New Roman" w:hAnsi="Times New Roman" w:eastAsia="Times New Roman"/>
@@ -2374,19 +2253,8 @@
         <w:tc>
           <w:tcPr>
             <w:tcW w:type="dxa" w:w="1560"/>
-            <w:tcBorders>
-              <w:top w:val="nil" w:sz="4" w:space="0" w:color="000000"/>
-              <w:left w:val="nil" w:sz="4" w:space="0" w:color="000000"/>
-              <w:bottom w:val="nil" w:sz="4" w:space="0" w:color="000000"/>
-              <w:right w:val="nil" w:sz="4" w:space="0" w:color="000000"/>
-              <w:insideH w:val="nil" w:sz="4" w:space="0" w:color="000000"/>
-              <w:insideV w:val="nil" w:sz="4" w:space="0" w:color="000000"/>
-            </w:tcBorders>
           </w:tcPr>
           <w:p>
-            <w:pPr>
-              <w:jc w:val="left"/>
-            </w:pPr>
             <w:r>
               <w:rPr>
                 <w:rFonts w:ascii="Times New Roman" w:hAnsi="Times New Roman" w:eastAsia="Times New Roman"/>
@@ -2402,19 +2270,8 @@
         <w:tc>
           <w:tcPr>
             <w:tcW w:type="dxa" w:w="1560"/>
-            <w:tcBorders>
-              <w:top w:val="nil" w:sz="4" w:space="0" w:color="000000"/>
-              <w:left w:val="nil" w:sz="4" w:space="0" w:color="000000"/>
-              <w:bottom w:val="nil" w:sz="4" w:space="0" w:color="000000"/>
-              <w:right w:val="nil" w:sz="4" w:space="0" w:color="000000"/>
-              <w:insideH w:val="nil" w:sz="4" w:space="0" w:color="000000"/>
-              <w:insideV w:val="nil" w:sz="4" w:space="0" w:color="000000"/>
-            </w:tcBorders>
           </w:tcPr>
           <w:p>
-            <w:pPr>
-              <w:jc w:val="left"/>
-            </w:pPr>
             <w:r>
               <w:rPr>
                 <w:rFonts w:ascii="Times New Roman" w:hAnsi="Times New Roman" w:eastAsia="Times New Roman"/>
@@ -2428,19 +2285,8 @@
         <w:tc>
           <w:tcPr>
             <w:tcW w:type="dxa" w:w="1560"/>
-            <w:tcBorders>
-              <w:top w:val="nil" w:sz="4" w:space="0" w:color="000000"/>
-              <w:left w:val="nil" w:sz="4" w:space="0" w:color="000000"/>
-              <w:bottom w:val="nil" w:sz="4" w:space="0" w:color="000000"/>
-              <w:right w:val="nil" w:sz="4" w:space="0" w:color="000000"/>
-              <w:insideH w:val="nil" w:sz="4" w:space="0" w:color="000000"/>
-              <w:insideV w:val="nil" w:sz="4" w:space="0" w:color="000000"/>
-            </w:tcBorders>
           </w:tcPr>
           <w:p>
-            <w:pPr>
-              <w:jc w:val="right"/>
-            </w:pPr>
             <w:r>
               <w:rPr>
                 <w:rFonts w:ascii="Times New Roman" w:hAnsi="Times New Roman" w:eastAsia="Times New Roman"/>
@@ -2454,19 +2300,8 @@
         <w:tc>
           <w:tcPr>
             <w:tcW w:type="dxa" w:w="1560"/>
-            <w:tcBorders>
-              <w:top w:val="nil" w:sz="4" w:space="0" w:color="000000"/>
-              <w:left w:val="nil" w:sz="4" w:space="0" w:color="000000"/>
-              <w:bottom w:val="nil" w:sz="4" w:space="0" w:color="000000"/>
-              <w:right w:val="nil" w:sz="4" w:space="0" w:color="000000"/>
-              <w:insideH w:val="nil" w:sz="4" w:space="0" w:color="000000"/>
-              <w:insideV w:val="nil" w:sz="4" w:space="0" w:color="000000"/>
-            </w:tcBorders>
           </w:tcPr>
           <w:p>
-            <w:pPr>
-              <w:jc w:val="right"/>
-            </w:pPr>
             <w:r>
               <w:rPr>
                 <w:rFonts w:ascii="Times New Roman" w:hAnsi="Times New Roman" w:eastAsia="Times New Roman"/>
@@ -2480,19 +2315,8 @@
         <w:tc>
           <w:tcPr>
             <w:tcW w:type="dxa" w:w="1560"/>
-            <w:tcBorders>
-              <w:top w:val="nil" w:sz="4" w:space="0" w:color="000000"/>
-              <w:left w:val="nil" w:sz="4" w:space="0" w:color="000000"/>
-              <w:bottom w:val="nil" w:sz="4" w:space="0" w:color="000000"/>
-              <w:right w:val="nil" w:sz="4" w:space="0" w:color="000000"/>
-              <w:insideH w:val="nil" w:sz="4" w:space="0" w:color="000000"/>
-              <w:insideV w:val="nil" w:sz="4" w:space="0" w:color="000000"/>
-            </w:tcBorders>
           </w:tcPr>
           <w:p>
-            <w:pPr>
-              <w:jc w:val="right"/>
-            </w:pPr>
             <w:r>
               <w:rPr>
                 <w:rFonts w:ascii="Times New Roman" w:hAnsi="Times New Roman" w:eastAsia="Times New Roman"/>
@@ -2506,19 +2330,8 @@
         <w:tc>
           <w:tcPr>
             <w:tcW w:type="dxa" w:w="1560"/>
-            <w:tcBorders>
-              <w:top w:val="nil" w:sz="4" w:space="0" w:color="000000"/>
-              <w:left w:val="nil" w:sz="4" w:space="0" w:color="000000"/>
-              <w:bottom w:val="nil" w:sz="4" w:space="0" w:color="000000"/>
-              <w:right w:val="nil" w:sz="4" w:space="0" w:color="000000"/>
-              <w:insideH w:val="nil" w:sz="4" w:space="0" w:color="000000"/>
-              <w:insideV w:val="nil" w:sz="4" w:space="0" w:color="000000"/>
-            </w:tcBorders>
           </w:tcPr>
           <w:p>
-            <w:pPr>
-              <w:jc w:val="left"/>
-            </w:pPr>
             <w:r>
               <w:rPr>
                 <w:rFonts w:ascii="Times New Roman" w:hAnsi="Times New Roman" w:eastAsia="Times New Roman"/>
@@ -2532,19 +2345,8 @@
         <w:tc>
           <w:tcPr>
             <w:tcW w:type="dxa" w:w="1560"/>
-            <w:tcBorders>
-              <w:top w:val="nil" w:sz="4" w:space="0" w:color="000000"/>
-              <w:left w:val="nil" w:sz="4" w:space="0" w:color="000000"/>
-              <w:bottom w:val="nil" w:sz="4" w:space="0" w:color="000000"/>
-              <w:right w:val="nil" w:sz="4" w:space="0" w:color="000000"/>
-              <w:insideH w:val="nil" w:sz="4" w:space="0" w:color="000000"/>
-              <w:insideV w:val="nil" w:sz="4" w:space="0" w:color="000000"/>
-            </w:tcBorders>
           </w:tcPr>
           <w:p>
-            <w:pPr>
-              <w:jc w:val="left"/>
-            </w:pPr>
             <w:r>
               <w:rPr>
                 <w:rFonts w:ascii="Times New Roman" w:hAnsi="Times New Roman" w:eastAsia="Times New Roman"/>
@@ -2560,19 +2362,8 @@
         <w:tc>
           <w:tcPr>
             <w:tcW w:type="dxa" w:w="1560"/>
-            <w:tcBorders>
-              <w:top w:val="nil" w:sz="4" w:space="0" w:color="000000"/>
-              <w:left w:val="nil" w:sz="4" w:space="0" w:color="000000"/>
-              <w:bottom w:val="single" w:sz="4" w:space="0" w:color="000000"/>
-              <w:right w:val="nil" w:sz="4" w:space="0" w:color="000000"/>
-              <w:insideH w:val="nil" w:sz="4" w:space="0" w:color="000000"/>
-              <w:insideV w:val="nil" w:sz="4" w:space="0" w:color="000000"/>
-            </w:tcBorders>
           </w:tcPr>
           <w:p>
-            <w:pPr>
-              <w:jc w:val="left"/>
-            </w:pPr>
             <w:r>
               <w:rPr>
                 <w:rFonts w:ascii="Times New Roman" w:hAnsi="Times New Roman" w:eastAsia="Times New Roman"/>
@@ -2586,19 +2377,8 @@
         <w:tc>
           <w:tcPr>
             <w:tcW w:type="dxa" w:w="1560"/>
-            <w:tcBorders>
-              <w:top w:val="nil" w:sz="4" w:space="0" w:color="000000"/>
-              <w:left w:val="nil" w:sz="4" w:space="0" w:color="000000"/>
-              <w:bottom w:val="single" w:sz="4" w:space="0" w:color="000000"/>
-              <w:right w:val="nil" w:sz="4" w:space="0" w:color="000000"/>
-              <w:insideH w:val="nil" w:sz="4" w:space="0" w:color="000000"/>
-              <w:insideV w:val="nil" w:sz="4" w:space="0" w:color="000000"/>
-            </w:tcBorders>
           </w:tcPr>
           <w:p>
-            <w:pPr>
-              <w:jc w:val="right"/>
-            </w:pPr>
             <w:r>
               <w:rPr>
                 <w:rFonts w:ascii="Times New Roman" w:hAnsi="Times New Roman" w:eastAsia="Times New Roman"/>
@@ -2612,19 +2392,8 @@
         <w:tc>
           <w:tcPr>
             <w:tcW w:type="dxa" w:w="1560"/>
-            <w:tcBorders>
-              <w:top w:val="nil" w:sz="4" w:space="0" w:color="000000"/>
-              <w:left w:val="nil" w:sz="4" w:space="0" w:color="000000"/>
-              <w:bottom w:val="single" w:sz="4" w:space="0" w:color="000000"/>
-              <w:right w:val="nil" w:sz="4" w:space="0" w:color="000000"/>
-              <w:insideH w:val="nil" w:sz="4" w:space="0" w:color="000000"/>
-              <w:insideV w:val="nil" w:sz="4" w:space="0" w:color="000000"/>
-            </w:tcBorders>
           </w:tcPr>
           <w:p>
-            <w:pPr>
-              <w:jc w:val="right"/>
-            </w:pPr>
             <w:r>
               <w:rPr>
                 <w:rFonts w:ascii="Times New Roman" w:hAnsi="Times New Roman" w:eastAsia="Times New Roman"/>
@@ -2638,19 +2407,8 @@
         <w:tc>
           <w:tcPr>
             <w:tcW w:type="dxa" w:w="1560"/>
-            <w:tcBorders>
-              <w:top w:val="nil" w:sz="4" w:space="0" w:color="000000"/>
-              <w:left w:val="nil" w:sz="4" w:space="0" w:color="000000"/>
-              <w:bottom w:val="single" w:sz="4" w:space="0" w:color="000000"/>
-              <w:right w:val="nil" w:sz="4" w:space="0" w:color="000000"/>
-              <w:insideH w:val="nil" w:sz="4" w:space="0" w:color="000000"/>
-              <w:insideV w:val="nil" w:sz="4" w:space="0" w:color="000000"/>
-            </w:tcBorders>
           </w:tcPr>
           <w:p>
-            <w:pPr>
-              <w:jc w:val="right"/>
-            </w:pPr>
             <w:r>
               <w:rPr>
                 <w:rFonts w:ascii="Times New Roman" w:hAnsi="Times New Roman" w:eastAsia="Times New Roman"/>
@@ -2664,19 +2422,8 @@
         <w:tc>
           <w:tcPr>
             <w:tcW w:type="dxa" w:w="1560"/>
-            <w:tcBorders>
-              <w:top w:val="nil" w:sz="4" w:space="0" w:color="000000"/>
-              <w:left w:val="nil" w:sz="4" w:space="0" w:color="000000"/>
-              <w:bottom w:val="single" w:sz="4" w:space="0" w:color="000000"/>
-              <w:right w:val="nil" w:sz="4" w:space="0" w:color="000000"/>
-              <w:insideH w:val="nil" w:sz="4" w:space="0" w:color="000000"/>
-              <w:insideV w:val="nil" w:sz="4" w:space="0" w:color="000000"/>
-            </w:tcBorders>
           </w:tcPr>
           <w:p>
-            <w:pPr>
-              <w:jc w:val="left"/>
-            </w:pPr>
             <w:r>
               <w:rPr>
                 <w:rFonts w:ascii="Times New Roman" w:hAnsi="Times New Roman" w:eastAsia="Times New Roman"/>
@@ -2690,19 +2437,8 @@
         <w:tc>
           <w:tcPr>
             <w:tcW w:type="dxa" w:w="1560"/>
-            <w:tcBorders>
-              <w:top w:val="nil" w:sz="4" w:space="0" w:color="000000"/>
-              <w:left w:val="nil" w:sz="4" w:space="0" w:color="000000"/>
-              <w:bottom w:val="single" w:sz="4" w:space="0" w:color="000000"/>
-              <w:right w:val="nil" w:sz="4" w:space="0" w:color="000000"/>
-              <w:insideH w:val="nil" w:sz="4" w:space="0" w:color="000000"/>
-              <w:insideV w:val="nil" w:sz="4" w:space="0" w:color="000000"/>
-            </w:tcBorders>
           </w:tcPr>
           <w:p>
-            <w:pPr>
-              <w:jc w:val="left"/>
-            </w:pPr>
             <w:r>
               <w:rPr>
                 <w:rFonts w:ascii="Times New Roman" w:hAnsi="Times New Roman" w:eastAsia="Times New Roman"/>
@@ -2827,19 +2563,8 @@
         <w:tc>
           <w:tcPr>
             <w:tcW w:type="dxa" w:w="1872"/>
-            <w:tcBorders>
-              <w:top w:val="single" w:sz="4" w:space="0" w:color="000000"/>
-              <w:left w:val="nil" w:sz="4" w:space="0" w:color="000000"/>
-              <w:bottom w:val="single" w:sz="4" w:space="0" w:color="000000"/>
-              <w:right w:val="nil" w:sz="4" w:space="0" w:color="000000"/>
-              <w:insideH w:val="nil" w:sz="4" w:space="0" w:color="000000"/>
-              <w:insideV w:val="nil" w:sz="4" w:space="0" w:color="000000"/>
-            </w:tcBorders>
           </w:tcPr>
           <w:p>
-            <w:pPr>
-              <w:jc w:val="center"/>
-            </w:pPr>
             <w:r>
               <w:rPr>
                 <w:rFonts w:ascii="Times New Roman" w:hAnsi="Times New Roman" w:eastAsia="Times New Roman"/>
@@ -2853,19 +2578,8 @@
         <w:tc>
           <w:tcPr>
             <w:tcW w:type="dxa" w:w="1872"/>
-            <w:tcBorders>
-              <w:top w:val="single" w:sz="4" w:space="0" w:color="000000"/>
-              <w:left w:val="nil" w:sz="4" w:space="0" w:color="000000"/>
-              <w:bottom w:val="single" w:sz="4" w:space="0" w:color="000000"/>
-              <w:right w:val="nil" w:sz="4" w:space="0" w:color="000000"/>
-              <w:insideH w:val="nil" w:sz="4" w:space="0" w:color="000000"/>
-              <w:insideV w:val="nil" w:sz="4" w:space="0" w:color="000000"/>
-            </w:tcBorders>
           </w:tcPr>
           <w:p>
-            <w:pPr>
-              <w:jc w:val="center"/>
-            </w:pPr>
             <w:r>
               <w:rPr>
                 <w:rFonts w:ascii="Times New Roman" w:hAnsi="Times New Roman" w:eastAsia="Times New Roman"/>
@@ -2879,19 +2593,8 @@
         <w:tc>
           <w:tcPr>
             <w:tcW w:type="dxa" w:w="1872"/>
-            <w:tcBorders>
-              <w:top w:val="single" w:sz="4" w:space="0" w:color="000000"/>
-              <w:left w:val="nil" w:sz="4" w:space="0" w:color="000000"/>
-              <w:bottom w:val="single" w:sz="4" w:space="0" w:color="000000"/>
-              <w:right w:val="nil" w:sz="4" w:space="0" w:color="000000"/>
-              <w:insideH w:val="nil" w:sz="4" w:space="0" w:color="000000"/>
-              <w:insideV w:val="nil" w:sz="4" w:space="0" w:color="000000"/>
-            </w:tcBorders>
           </w:tcPr>
           <w:p>
-            <w:pPr>
-              <w:jc w:val="center"/>
-            </w:pPr>
             <w:r>
               <w:rPr>
                 <w:rFonts w:ascii="Times New Roman" w:hAnsi="Times New Roman" w:eastAsia="Times New Roman"/>
@@ -2905,19 +2608,8 @@
         <w:tc>
           <w:tcPr>
             <w:tcW w:type="dxa" w:w="1872"/>
-            <w:tcBorders>
-              <w:top w:val="single" w:sz="4" w:space="0" w:color="000000"/>
-              <w:left w:val="nil" w:sz="4" w:space="0" w:color="000000"/>
-              <w:bottom w:val="single" w:sz="4" w:space="0" w:color="000000"/>
-              <w:right w:val="nil" w:sz="4" w:space="0" w:color="000000"/>
-              <w:insideH w:val="nil" w:sz="4" w:space="0" w:color="000000"/>
-              <w:insideV w:val="nil" w:sz="4" w:space="0" w:color="000000"/>
-            </w:tcBorders>
           </w:tcPr>
           <w:p>
-            <w:pPr>
-              <w:jc w:val="center"/>
-            </w:pPr>
             <w:r>
               <w:rPr>
                 <w:rFonts w:ascii="Times New Roman" w:hAnsi="Times New Roman" w:eastAsia="Times New Roman"/>
@@ -2931,19 +2623,8 @@
         <w:tc>
           <w:tcPr>
             <w:tcW w:type="dxa" w:w="1872"/>
-            <w:tcBorders>
-              <w:top w:val="single" w:sz="4" w:space="0" w:color="000000"/>
-              <w:left w:val="nil" w:sz="4" w:space="0" w:color="000000"/>
-              <w:bottom w:val="single" w:sz="4" w:space="0" w:color="000000"/>
-              <w:right w:val="nil" w:sz="4" w:space="0" w:color="000000"/>
-              <w:insideH w:val="nil" w:sz="4" w:space="0" w:color="000000"/>
-              <w:insideV w:val="nil" w:sz="4" w:space="0" w:color="000000"/>
-            </w:tcBorders>
           </w:tcPr>
           <w:p>
-            <w:pPr>
-              <w:jc w:val="center"/>
-            </w:pPr>
             <w:r>
               <w:rPr>
                 <w:rFonts w:ascii="Times New Roman" w:hAnsi="Times New Roman" w:eastAsia="Times New Roman"/>
@@ -2959,19 +2640,8 @@
         <w:tc>
           <w:tcPr>
             <w:tcW w:type="dxa" w:w="1872"/>
-            <w:tcBorders>
-              <w:top w:val="nil" w:sz="4" w:space="0" w:color="000000"/>
-              <w:left w:val="nil" w:sz="4" w:space="0" w:color="000000"/>
-              <w:bottom w:val="nil" w:sz="4" w:space="0" w:color="000000"/>
-              <w:right w:val="nil" w:sz="4" w:space="0" w:color="000000"/>
-              <w:insideH w:val="nil" w:sz="4" w:space="0" w:color="000000"/>
-              <w:insideV w:val="nil" w:sz="4" w:space="0" w:color="000000"/>
-            </w:tcBorders>
           </w:tcPr>
           <w:p>
-            <w:pPr>
-              <w:jc w:val="left"/>
-            </w:pPr>
             <w:r>
               <w:rPr>
                 <w:rFonts w:ascii="Times New Roman" w:hAnsi="Times New Roman" w:eastAsia="Times New Roman"/>
@@ -2985,19 +2655,8 @@
         <w:tc>
           <w:tcPr>
             <w:tcW w:type="dxa" w:w="1872"/>
-            <w:tcBorders>
-              <w:top w:val="nil" w:sz="4" w:space="0" w:color="000000"/>
-              <w:left w:val="nil" w:sz="4" w:space="0" w:color="000000"/>
-              <w:bottom w:val="nil" w:sz="4" w:space="0" w:color="000000"/>
-              <w:right w:val="nil" w:sz="4" w:space="0" w:color="000000"/>
-              <w:insideH w:val="nil" w:sz="4" w:space="0" w:color="000000"/>
-              <w:insideV w:val="nil" w:sz="4" w:space="0" w:color="000000"/>
-            </w:tcBorders>
           </w:tcPr>
           <w:p>
-            <w:pPr>
-              <w:jc w:val="left"/>
-            </w:pPr>
             <w:r>
               <w:rPr>
                 <w:rFonts w:ascii="Times New Roman" w:hAnsi="Times New Roman" w:eastAsia="Times New Roman"/>
@@ -3011,19 +2670,8 @@
         <w:tc>
           <w:tcPr>
             <w:tcW w:type="dxa" w:w="1872"/>
-            <w:tcBorders>
-              <w:top w:val="nil" w:sz="4" w:space="0" w:color="000000"/>
-              <w:left w:val="nil" w:sz="4" w:space="0" w:color="000000"/>
-              <w:bottom w:val="nil" w:sz="4" w:space="0" w:color="000000"/>
-              <w:right w:val="nil" w:sz="4" w:space="0" w:color="000000"/>
-              <w:insideH w:val="nil" w:sz="4" w:space="0" w:color="000000"/>
-              <w:insideV w:val="nil" w:sz="4" w:space="0" w:color="000000"/>
-            </w:tcBorders>
           </w:tcPr>
           <w:p>
-            <w:pPr>
-              <w:jc w:val="right"/>
-            </w:pPr>
             <w:r>
               <w:rPr>
                 <w:rFonts w:ascii="Times New Roman" w:hAnsi="Times New Roman" w:eastAsia="Times New Roman"/>
@@ -3037,19 +2685,8 @@
         <w:tc>
           <w:tcPr>
             <w:tcW w:type="dxa" w:w="1872"/>
-            <w:tcBorders>
-              <w:top w:val="nil" w:sz="4" w:space="0" w:color="000000"/>
-              <w:left w:val="nil" w:sz="4" w:space="0" w:color="000000"/>
-              <w:bottom w:val="nil" w:sz="4" w:space="0" w:color="000000"/>
-              <w:right w:val="nil" w:sz="4" w:space="0" w:color="000000"/>
-              <w:insideH w:val="nil" w:sz="4" w:space="0" w:color="000000"/>
-              <w:insideV w:val="nil" w:sz="4" w:space="0" w:color="000000"/>
-            </w:tcBorders>
           </w:tcPr>
           <w:p>
-            <w:pPr>
-              <w:jc w:val="left"/>
-            </w:pPr>
             <w:r>
               <w:rPr>
                 <w:rFonts w:ascii="Times New Roman" w:hAnsi="Times New Roman" w:eastAsia="Times New Roman"/>
@@ -3063,19 +2700,8 @@
         <w:tc>
           <w:tcPr>
             <w:tcW w:type="dxa" w:w="1872"/>
-            <w:tcBorders>
-              <w:top w:val="nil" w:sz="4" w:space="0" w:color="000000"/>
-              <w:left w:val="nil" w:sz="4" w:space="0" w:color="000000"/>
-              <w:bottom w:val="nil" w:sz="4" w:space="0" w:color="000000"/>
-              <w:right w:val="nil" w:sz="4" w:space="0" w:color="000000"/>
-              <w:insideH w:val="nil" w:sz="4" w:space="0" w:color="000000"/>
-              <w:insideV w:val="nil" w:sz="4" w:space="0" w:color="000000"/>
-            </w:tcBorders>
           </w:tcPr>
           <w:p>
-            <w:pPr>
-              <w:jc w:val="left"/>
-            </w:pPr>
             <w:r>
               <w:rPr>
                 <w:rFonts w:ascii="Times New Roman" w:hAnsi="Times New Roman" w:eastAsia="Times New Roman"/>
@@ -3091,19 +2717,8 @@
         <w:tc>
           <w:tcPr>
             <w:tcW w:type="dxa" w:w="1872"/>
-            <w:tcBorders>
-              <w:top w:val="nil" w:sz="4" w:space="0" w:color="000000"/>
-              <w:left w:val="nil" w:sz="4" w:space="0" w:color="000000"/>
-              <w:bottom w:val="nil" w:sz="4" w:space="0" w:color="000000"/>
-              <w:right w:val="nil" w:sz="4" w:space="0" w:color="000000"/>
-              <w:insideH w:val="nil" w:sz="4" w:space="0" w:color="000000"/>
-              <w:insideV w:val="nil" w:sz="4" w:space="0" w:color="000000"/>
-            </w:tcBorders>
           </w:tcPr>
           <w:p>
-            <w:pPr>
-              <w:jc w:val="left"/>
-            </w:pPr>
             <w:r>
               <w:rPr>
                 <w:rFonts w:ascii="Times New Roman" w:hAnsi="Times New Roman" w:eastAsia="Times New Roman"/>
@@ -3117,19 +2732,8 @@
         <w:tc>
           <w:tcPr>
             <w:tcW w:type="dxa" w:w="1872"/>
-            <w:tcBorders>
-              <w:top w:val="nil" w:sz="4" w:space="0" w:color="000000"/>
-              <w:left w:val="nil" w:sz="4" w:space="0" w:color="000000"/>
-              <w:bottom w:val="nil" w:sz="4" w:space="0" w:color="000000"/>
-              <w:right w:val="nil" w:sz="4" w:space="0" w:color="000000"/>
-              <w:insideH w:val="nil" w:sz="4" w:space="0" w:color="000000"/>
-              <w:insideV w:val="nil" w:sz="4" w:space="0" w:color="000000"/>
-            </w:tcBorders>
           </w:tcPr>
           <w:p>
-            <w:pPr>
-              <w:jc w:val="left"/>
-            </w:pPr>
             <w:r>
               <w:rPr>
                 <w:rFonts w:ascii="Times New Roman" w:hAnsi="Times New Roman" w:eastAsia="Times New Roman"/>
@@ -3143,19 +2747,8 @@
         <w:tc>
           <w:tcPr>
             <w:tcW w:type="dxa" w:w="1872"/>
-            <w:tcBorders>
-              <w:top w:val="nil" w:sz="4" w:space="0" w:color="000000"/>
-              <w:left w:val="nil" w:sz="4" w:space="0" w:color="000000"/>
-              <w:bottom w:val="nil" w:sz="4" w:space="0" w:color="000000"/>
-              <w:right w:val="nil" w:sz="4" w:space="0" w:color="000000"/>
-              <w:insideH w:val="nil" w:sz="4" w:space="0" w:color="000000"/>
-              <w:insideV w:val="nil" w:sz="4" w:space="0" w:color="000000"/>
-            </w:tcBorders>
           </w:tcPr>
           <w:p>
-            <w:pPr>
-              <w:jc w:val="right"/>
-            </w:pPr>
             <w:r>
               <w:rPr>
                 <w:rFonts w:ascii="Times New Roman" w:hAnsi="Times New Roman" w:eastAsia="Times New Roman"/>
@@ -3169,19 +2762,8 @@
         <w:tc>
           <w:tcPr>
             <w:tcW w:type="dxa" w:w="1872"/>
-            <w:tcBorders>
-              <w:top w:val="nil" w:sz="4" w:space="0" w:color="000000"/>
-              <w:left w:val="nil" w:sz="4" w:space="0" w:color="000000"/>
-              <w:bottom w:val="nil" w:sz="4" w:space="0" w:color="000000"/>
-              <w:right w:val="nil" w:sz="4" w:space="0" w:color="000000"/>
-              <w:insideH w:val="nil" w:sz="4" w:space="0" w:color="000000"/>
-              <w:insideV w:val="nil" w:sz="4" w:space="0" w:color="000000"/>
-            </w:tcBorders>
           </w:tcPr>
           <w:p>
-            <w:pPr>
-              <w:jc w:val="left"/>
-            </w:pPr>
             <w:r>
               <w:rPr>
                 <w:rFonts w:ascii="Times New Roman" w:hAnsi="Times New Roman" w:eastAsia="Times New Roman"/>
@@ -3195,19 +2777,8 @@
         <w:tc>
           <w:tcPr>
             <w:tcW w:type="dxa" w:w="1872"/>
-            <w:tcBorders>
-              <w:top w:val="nil" w:sz="4" w:space="0" w:color="000000"/>
-              <w:left w:val="nil" w:sz="4" w:space="0" w:color="000000"/>
-              <w:bottom w:val="nil" w:sz="4" w:space="0" w:color="000000"/>
-              <w:right w:val="nil" w:sz="4" w:space="0" w:color="000000"/>
-              <w:insideH w:val="nil" w:sz="4" w:space="0" w:color="000000"/>
-              <w:insideV w:val="nil" w:sz="4" w:space="0" w:color="000000"/>
-            </w:tcBorders>
           </w:tcPr>
           <w:p>
-            <w:pPr>
-              <w:jc w:val="left"/>
-            </w:pPr>
             <w:r>
               <w:rPr>
                 <w:rFonts w:ascii="Times New Roman" w:hAnsi="Times New Roman" w:eastAsia="Times New Roman"/>
@@ -3223,19 +2794,8 @@
         <w:tc>
           <w:tcPr>
             <w:tcW w:type="dxa" w:w="1872"/>
-            <w:tcBorders>
-              <w:top w:val="nil" w:sz="4" w:space="0" w:color="000000"/>
-              <w:left w:val="nil" w:sz="4" w:space="0" w:color="000000"/>
-              <w:bottom w:val="nil" w:sz="4" w:space="0" w:color="000000"/>
-              <w:right w:val="nil" w:sz="4" w:space="0" w:color="000000"/>
-              <w:insideH w:val="nil" w:sz="4" w:space="0" w:color="000000"/>
-              <w:insideV w:val="nil" w:sz="4" w:space="0" w:color="000000"/>
-            </w:tcBorders>
           </w:tcPr>
           <w:p>
-            <w:pPr>
-              <w:jc w:val="left"/>
-            </w:pPr>
             <w:r>
               <w:rPr>
                 <w:rFonts w:ascii="Times New Roman" w:hAnsi="Times New Roman" w:eastAsia="Times New Roman"/>
@@ -3249,19 +2809,8 @@
         <w:tc>
           <w:tcPr>
             <w:tcW w:type="dxa" w:w="1872"/>
-            <w:tcBorders>
-              <w:top w:val="nil" w:sz="4" w:space="0" w:color="000000"/>
-              <w:left w:val="nil" w:sz="4" w:space="0" w:color="000000"/>
-              <w:bottom w:val="nil" w:sz="4" w:space="0" w:color="000000"/>
-              <w:right w:val="nil" w:sz="4" w:space="0" w:color="000000"/>
-              <w:insideH w:val="nil" w:sz="4" w:space="0" w:color="000000"/>
-              <w:insideV w:val="nil" w:sz="4" w:space="0" w:color="000000"/>
-            </w:tcBorders>
           </w:tcPr>
           <w:p>
-            <w:pPr>
-              <w:jc w:val="left"/>
-            </w:pPr>
             <w:r>
               <w:rPr>
                 <w:rFonts w:ascii="Times New Roman" w:hAnsi="Times New Roman" w:eastAsia="Times New Roman"/>
@@ -3275,19 +2824,8 @@
         <w:tc>
           <w:tcPr>
             <w:tcW w:type="dxa" w:w="1872"/>
-            <w:tcBorders>
-              <w:top w:val="nil" w:sz="4" w:space="0" w:color="000000"/>
-              <w:left w:val="nil" w:sz="4" w:space="0" w:color="000000"/>
-              <w:bottom w:val="nil" w:sz="4" w:space="0" w:color="000000"/>
-              <w:right w:val="nil" w:sz="4" w:space="0" w:color="000000"/>
-              <w:insideH w:val="nil" w:sz="4" w:space="0" w:color="000000"/>
-              <w:insideV w:val="nil" w:sz="4" w:space="0" w:color="000000"/>
-            </w:tcBorders>
           </w:tcPr>
           <w:p>
-            <w:pPr>
-              <w:jc w:val="right"/>
-            </w:pPr>
             <w:r>
               <w:rPr>
                 <w:rFonts w:ascii="Times New Roman" w:hAnsi="Times New Roman" w:eastAsia="Times New Roman"/>
@@ -3301,19 +2839,8 @@
         <w:tc>
           <w:tcPr>
             <w:tcW w:type="dxa" w:w="1872"/>
-            <w:tcBorders>
-              <w:top w:val="nil" w:sz="4" w:space="0" w:color="000000"/>
-              <w:left w:val="nil" w:sz="4" w:space="0" w:color="000000"/>
-              <w:bottom w:val="nil" w:sz="4" w:space="0" w:color="000000"/>
-              <w:right w:val="nil" w:sz="4" w:space="0" w:color="000000"/>
-              <w:insideH w:val="nil" w:sz="4" w:space="0" w:color="000000"/>
-              <w:insideV w:val="nil" w:sz="4" w:space="0" w:color="000000"/>
-            </w:tcBorders>
           </w:tcPr>
           <w:p>
-            <w:pPr>
-              <w:jc w:val="left"/>
-            </w:pPr>
             <w:r>
               <w:rPr>
                 <w:rFonts w:ascii="Times New Roman" w:hAnsi="Times New Roman" w:eastAsia="Times New Roman"/>
@@ -3327,19 +2854,8 @@
         <w:tc>
           <w:tcPr>
             <w:tcW w:type="dxa" w:w="1872"/>
-            <w:tcBorders>
-              <w:top w:val="nil" w:sz="4" w:space="0" w:color="000000"/>
-              <w:left w:val="nil" w:sz="4" w:space="0" w:color="000000"/>
-              <w:bottom w:val="nil" w:sz="4" w:space="0" w:color="000000"/>
-              <w:right w:val="nil" w:sz="4" w:space="0" w:color="000000"/>
-              <w:insideH w:val="nil" w:sz="4" w:space="0" w:color="000000"/>
-              <w:insideV w:val="nil" w:sz="4" w:space="0" w:color="000000"/>
-            </w:tcBorders>
           </w:tcPr>
           <w:p>
-            <w:pPr>
-              <w:jc w:val="left"/>
-            </w:pPr>
             <w:r>
               <w:rPr>
                 <w:rFonts w:ascii="Times New Roman" w:hAnsi="Times New Roman" w:eastAsia="Times New Roman"/>
@@ -3355,19 +2871,8 @@
         <w:tc>
           <w:tcPr>
             <w:tcW w:type="dxa" w:w="1872"/>
-            <w:tcBorders>
-              <w:top w:val="nil" w:sz="4" w:space="0" w:color="000000"/>
-              <w:left w:val="nil" w:sz="4" w:space="0" w:color="000000"/>
-              <w:bottom w:val="nil" w:sz="4" w:space="0" w:color="000000"/>
-              <w:right w:val="nil" w:sz="4" w:space="0" w:color="000000"/>
-              <w:insideH w:val="nil" w:sz="4" w:space="0" w:color="000000"/>
-              <w:insideV w:val="nil" w:sz="4" w:space="0" w:color="000000"/>
-            </w:tcBorders>
           </w:tcPr>
           <w:p>
-            <w:pPr>
-              <w:jc w:val="left"/>
-            </w:pPr>
             <w:r>
               <w:rPr>
                 <w:rFonts w:ascii="Times New Roman" w:hAnsi="Times New Roman" w:eastAsia="Times New Roman"/>
@@ -3381,19 +2886,8 @@
         <w:tc>
           <w:tcPr>
             <w:tcW w:type="dxa" w:w="1872"/>
-            <w:tcBorders>
-              <w:top w:val="nil" w:sz="4" w:space="0" w:color="000000"/>
-              <w:left w:val="nil" w:sz="4" w:space="0" w:color="000000"/>
-              <w:bottom w:val="nil" w:sz="4" w:space="0" w:color="000000"/>
-              <w:right w:val="nil" w:sz="4" w:space="0" w:color="000000"/>
-              <w:insideH w:val="nil" w:sz="4" w:space="0" w:color="000000"/>
-              <w:insideV w:val="nil" w:sz="4" w:space="0" w:color="000000"/>
-            </w:tcBorders>
           </w:tcPr>
           <w:p>
-            <w:pPr>
-              <w:jc w:val="left"/>
-            </w:pPr>
             <w:r>
               <w:rPr>
                 <w:rFonts w:ascii="Times New Roman" w:hAnsi="Times New Roman" w:eastAsia="Times New Roman"/>
@@ -3407,19 +2901,8 @@
         <w:tc>
           <w:tcPr>
             <w:tcW w:type="dxa" w:w="1872"/>
-            <w:tcBorders>
-              <w:top w:val="nil" w:sz="4" w:space="0" w:color="000000"/>
-              <w:left w:val="nil" w:sz="4" w:space="0" w:color="000000"/>
-              <w:bottom w:val="nil" w:sz="4" w:space="0" w:color="000000"/>
-              <w:right w:val="nil" w:sz="4" w:space="0" w:color="000000"/>
-              <w:insideH w:val="nil" w:sz="4" w:space="0" w:color="000000"/>
-              <w:insideV w:val="nil" w:sz="4" w:space="0" w:color="000000"/>
-            </w:tcBorders>
           </w:tcPr>
           <w:p>
-            <w:pPr>
-              <w:jc w:val="right"/>
-            </w:pPr>
             <w:r>
               <w:rPr>
                 <w:rFonts w:ascii="Times New Roman" w:hAnsi="Times New Roman" w:eastAsia="Times New Roman"/>
@@ -3433,19 +2916,8 @@
         <w:tc>
           <w:tcPr>
             <w:tcW w:type="dxa" w:w="1872"/>
-            <w:tcBorders>
-              <w:top w:val="nil" w:sz="4" w:space="0" w:color="000000"/>
-              <w:left w:val="nil" w:sz="4" w:space="0" w:color="000000"/>
-              <w:bottom w:val="nil" w:sz="4" w:space="0" w:color="000000"/>
-              <w:right w:val="nil" w:sz="4" w:space="0" w:color="000000"/>
-              <w:insideH w:val="nil" w:sz="4" w:space="0" w:color="000000"/>
-              <w:insideV w:val="nil" w:sz="4" w:space="0" w:color="000000"/>
-            </w:tcBorders>
           </w:tcPr>
           <w:p>
-            <w:pPr>
-              <w:jc w:val="left"/>
-            </w:pPr>
             <w:r>
               <w:rPr>
                 <w:rFonts w:ascii="Times New Roman" w:hAnsi="Times New Roman" w:eastAsia="Times New Roman"/>
@@ -3459,19 +2931,8 @@
         <w:tc>
           <w:tcPr>
             <w:tcW w:type="dxa" w:w="1872"/>
-            <w:tcBorders>
-              <w:top w:val="nil" w:sz="4" w:space="0" w:color="000000"/>
-              <w:left w:val="nil" w:sz="4" w:space="0" w:color="000000"/>
-              <w:bottom w:val="nil" w:sz="4" w:space="0" w:color="000000"/>
-              <w:right w:val="nil" w:sz="4" w:space="0" w:color="000000"/>
-              <w:insideH w:val="nil" w:sz="4" w:space="0" w:color="000000"/>
-              <w:insideV w:val="nil" w:sz="4" w:space="0" w:color="000000"/>
-            </w:tcBorders>
           </w:tcPr>
           <w:p>
-            <w:pPr>
-              <w:jc w:val="left"/>
-            </w:pPr>
             <w:r>
               <w:rPr>
                 <w:rFonts w:ascii="Times New Roman" w:hAnsi="Times New Roman" w:eastAsia="Times New Roman"/>
@@ -3487,19 +2948,8 @@
         <w:tc>
           <w:tcPr>
             <w:tcW w:type="dxa" w:w="1872"/>
-            <w:tcBorders>
-              <w:top w:val="nil" w:sz="4" w:space="0" w:color="000000"/>
-              <w:left w:val="nil" w:sz="4" w:space="0" w:color="000000"/>
-              <w:bottom w:val="nil" w:sz="4" w:space="0" w:color="000000"/>
-              <w:right w:val="nil" w:sz="4" w:space="0" w:color="000000"/>
-              <w:insideH w:val="nil" w:sz="4" w:space="0" w:color="000000"/>
-              <w:insideV w:val="nil" w:sz="4" w:space="0" w:color="000000"/>
-            </w:tcBorders>
           </w:tcPr>
           <w:p>
-            <w:pPr>
-              <w:jc w:val="left"/>
-            </w:pPr>
             <w:r>
               <w:rPr>
                 <w:rFonts w:ascii="Times New Roman" w:hAnsi="Times New Roman" w:eastAsia="Times New Roman"/>
@@ -3513,19 +2963,8 @@
         <w:tc>
           <w:tcPr>
             <w:tcW w:type="dxa" w:w="1872"/>
-            <w:tcBorders>
-              <w:top w:val="nil" w:sz="4" w:space="0" w:color="000000"/>
-              <w:left w:val="nil" w:sz="4" w:space="0" w:color="000000"/>
-              <w:bottom w:val="nil" w:sz="4" w:space="0" w:color="000000"/>
-              <w:right w:val="nil" w:sz="4" w:space="0" w:color="000000"/>
-              <w:insideH w:val="nil" w:sz="4" w:space="0" w:color="000000"/>
-              <w:insideV w:val="nil" w:sz="4" w:space="0" w:color="000000"/>
-            </w:tcBorders>
           </w:tcPr>
           <w:p>
-            <w:pPr>
-              <w:jc w:val="left"/>
-            </w:pPr>
             <w:r>
               <w:rPr>
                 <w:rFonts w:ascii="Times New Roman" w:hAnsi="Times New Roman" w:eastAsia="Times New Roman"/>
@@ -3539,19 +2978,8 @@
         <w:tc>
           <w:tcPr>
             <w:tcW w:type="dxa" w:w="1872"/>
-            <w:tcBorders>
-              <w:top w:val="nil" w:sz="4" w:space="0" w:color="000000"/>
-              <w:left w:val="nil" w:sz="4" w:space="0" w:color="000000"/>
-              <w:bottom w:val="nil" w:sz="4" w:space="0" w:color="000000"/>
-              <w:right w:val="nil" w:sz="4" w:space="0" w:color="000000"/>
-              <w:insideH w:val="nil" w:sz="4" w:space="0" w:color="000000"/>
-              <w:insideV w:val="nil" w:sz="4" w:space="0" w:color="000000"/>
-            </w:tcBorders>
           </w:tcPr>
           <w:p>
-            <w:pPr>
-              <w:jc w:val="right"/>
-            </w:pPr>
             <w:r>
               <w:rPr>
                 <w:rFonts w:ascii="Times New Roman" w:hAnsi="Times New Roman" w:eastAsia="Times New Roman"/>
@@ -3565,19 +2993,8 @@
         <w:tc>
           <w:tcPr>
             <w:tcW w:type="dxa" w:w="1872"/>
-            <w:tcBorders>
-              <w:top w:val="nil" w:sz="4" w:space="0" w:color="000000"/>
-              <w:left w:val="nil" w:sz="4" w:space="0" w:color="000000"/>
-              <w:bottom w:val="nil" w:sz="4" w:space="0" w:color="000000"/>
-              <w:right w:val="nil" w:sz="4" w:space="0" w:color="000000"/>
-              <w:insideH w:val="nil" w:sz="4" w:space="0" w:color="000000"/>
-              <w:insideV w:val="nil" w:sz="4" w:space="0" w:color="000000"/>
-            </w:tcBorders>
           </w:tcPr>
           <w:p>
-            <w:pPr>
-              <w:jc w:val="left"/>
-            </w:pPr>
             <w:r>
               <w:rPr>
                 <w:rFonts w:ascii="Times New Roman" w:hAnsi="Times New Roman" w:eastAsia="Times New Roman"/>
@@ -3591,19 +3008,8 @@
         <w:tc>
           <w:tcPr>
             <w:tcW w:type="dxa" w:w="1872"/>
-            <w:tcBorders>
-              <w:top w:val="nil" w:sz="4" w:space="0" w:color="000000"/>
-              <w:left w:val="nil" w:sz="4" w:space="0" w:color="000000"/>
-              <w:bottom w:val="nil" w:sz="4" w:space="0" w:color="000000"/>
-              <w:right w:val="nil" w:sz="4" w:space="0" w:color="000000"/>
-              <w:insideH w:val="nil" w:sz="4" w:space="0" w:color="000000"/>
-              <w:insideV w:val="nil" w:sz="4" w:space="0" w:color="000000"/>
-            </w:tcBorders>
           </w:tcPr>
           <w:p>
-            <w:pPr>
-              <w:jc w:val="left"/>
-            </w:pPr>
             <w:r>
               <w:rPr>
                 <w:rFonts w:ascii="Times New Roman" w:hAnsi="Times New Roman" w:eastAsia="Times New Roman"/>
@@ -3619,19 +3025,8 @@
         <w:tc>
           <w:tcPr>
             <w:tcW w:type="dxa" w:w="1872"/>
-            <w:tcBorders>
-              <w:top w:val="nil" w:sz="4" w:space="0" w:color="000000"/>
-              <w:left w:val="nil" w:sz="4" w:space="0" w:color="000000"/>
-              <w:bottom w:val="nil" w:sz="4" w:space="0" w:color="000000"/>
-              <w:right w:val="nil" w:sz="4" w:space="0" w:color="000000"/>
-              <w:insideH w:val="nil" w:sz="4" w:space="0" w:color="000000"/>
-              <w:insideV w:val="nil" w:sz="4" w:space="0" w:color="000000"/>
-            </w:tcBorders>
           </w:tcPr>
           <w:p>
-            <w:pPr>
-              <w:jc w:val="left"/>
-            </w:pPr>
             <w:r>
               <w:rPr>
                 <w:rFonts w:ascii="Times New Roman" w:hAnsi="Times New Roman" w:eastAsia="Times New Roman"/>
@@ -3645,19 +3040,8 @@
         <w:tc>
           <w:tcPr>
             <w:tcW w:type="dxa" w:w="1872"/>
-            <w:tcBorders>
-              <w:top w:val="nil" w:sz="4" w:space="0" w:color="000000"/>
-              <w:left w:val="nil" w:sz="4" w:space="0" w:color="000000"/>
-              <w:bottom w:val="nil" w:sz="4" w:space="0" w:color="000000"/>
-              <w:right w:val="nil" w:sz="4" w:space="0" w:color="000000"/>
-              <w:insideH w:val="nil" w:sz="4" w:space="0" w:color="000000"/>
-              <w:insideV w:val="nil" w:sz="4" w:space="0" w:color="000000"/>
-            </w:tcBorders>
           </w:tcPr>
           <w:p>
-            <w:pPr>
-              <w:jc w:val="left"/>
-            </w:pPr>
             <w:r>
               <w:rPr>
                 <w:rFonts w:ascii="Times New Roman" w:hAnsi="Times New Roman" w:eastAsia="Times New Roman"/>
@@ -3671,19 +3055,8 @@
         <w:tc>
           <w:tcPr>
             <w:tcW w:type="dxa" w:w="1872"/>
-            <w:tcBorders>
-              <w:top w:val="nil" w:sz="4" w:space="0" w:color="000000"/>
-              <w:left w:val="nil" w:sz="4" w:space="0" w:color="000000"/>
-              <w:bottom w:val="nil" w:sz="4" w:space="0" w:color="000000"/>
-              <w:right w:val="nil" w:sz="4" w:space="0" w:color="000000"/>
-              <w:insideH w:val="nil" w:sz="4" w:space="0" w:color="000000"/>
-              <w:insideV w:val="nil" w:sz="4" w:space="0" w:color="000000"/>
-            </w:tcBorders>
           </w:tcPr>
           <w:p>
-            <w:pPr>
-              <w:jc w:val="right"/>
-            </w:pPr>
             <w:r>
               <w:rPr>
                 <w:rFonts w:ascii="Times New Roman" w:hAnsi="Times New Roman" w:eastAsia="Times New Roman"/>
@@ -3697,19 +3070,8 @@
         <w:tc>
           <w:tcPr>
             <w:tcW w:type="dxa" w:w="1872"/>
-            <w:tcBorders>
-              <w:top w:val="nil" w:sz="4" w:space="0" w:color="000000"/>
-              <w:left w:val="nil" w:sz="4" w:space="0" w:color="000000"/>
-              <w:bottom w:val="nil" w:sz="4" w:space="0" w:color="000000"/>
-              <w:right w:val="nil" w:sz="4" w:space="0" w:color="000000"/>
-              <w:insideH w:val="nil" w:sz="4" w:space="0" w:color="000000"/>
-              <w:insideV w:val="nil" w:sz="4" w:space="0" w:color="000000"/>
-            </w:tcBorders>
           </w:tcPr>
           <w:p>
-            <w:pPr>
-              <w:jc w:val="left"/>
-            </w:pPr>
             <w:r>
               <w:rPr>
                 <w:rFonts w:ascii="Times New Roman" w:hAnsi="Times New Roman" w:eastAsia="Times New Roman"/>
@@ -3723,19 +3085,8 @@
         <w:tc>
           <w:tcPr>
             <w:tcW w:type="dxa" w:w="1872"/>
-            <w:tcBorders>
-              <w:top w:val="nil" w:sz="4" w:space="0" w:color="000000"/>
-              <w:left w:val="nil" w:sz="4" w:space="0" w:color="000000"/>
-              <w:bottom w:val="nil" w:sz="4" w:space="0" w:color="000000"/>
-              <w:right w:val="nil" w:sz="4" w:space="0" w:color="000000"/>
-              <w:insideH w:val="nil" w:sz="4" w:space="0" w:color="000000"/>
-              <w:insideV w:val="nil" w:sz="4" w:space="0" w:color="000000"/>
-            </w:tcBorders>
           </w:tcPr>
           <w:p>
-            <w:pPr>
-              <w:jc w:val="left"/>
-            </w:pPr>
             <w:r>
               <w:rPr>
                 <w:rFonts w:ascii="Times New Roman" w:hAnsi="Times New Roman" w:eastAsia="Times New Roman"/>
@@ -3751,19 +3102,8 @@
         <w:tc>
           <w:tcPr>
             <w:tcW w:type="dxa" w:w="1872"/>
-            <w:tcBorders>
-              <w:top w:val="nil" w:sz="4" w:space="0" w:color="000000"/>
-              <w:left w:val="nil" w:sz="4" w:space="0" w:color="000000"/>
-              <w:bottom w:val="nil" w:sz="4" w:space="0" w:color="000000"/>
-              <w:right w:val="nil" w:sz="4" w:space="0" w:color="000000"/>
-              <w:insideH w:val="nil" w:sz="4" w:space="0" w:color="000000"/>
-              <w:insideV w:val="nil" w:sz="4" w:space="0" w:color="000000"/>
-            </w:tcBorders>
           </w:tcPr>
           <w:p>
-            <w:pPr>
-              <w:jc w:val="left"/>
-            </w:pPr>
             <w:r>
               <w:rPr>
                 <w:rFonts w:ascii="Times New Roman" w:hAnsi="Times New Roman" w:eastAsia="Times New Roman"/>
@@ -3777,19 +3117,8 @@
         <w:tc>
           <w:tcPr>
             <w:tcW w:type="dxa" w:w="1872"/>
-            <w:tcBorders>
-              <w:top w:val="nil" w:sz="4" w:space="0" w:color="000000"/>
-              <w:left w:val="nil" w:sz="4" w:space="0" w:color="000000"/>
-              <w:bottom w:val="nil" w:sz="4" w:space="0" w:color="000000"/>
-              <w:right w:val="nil" w:sz="4" w:space="0" w:color="000000"/>
-              <w:insideH w:val="nil" w:sz="4" w:space="0" w:color="000000"/>
-              <w:insideV w:val="nil" w:sz="4" w:space="0" w:color="000000"/>
-            </w:tcBorders>
           </w:tcPr>
           <w:p>
-            <w:pPr>
-              <w:jc w:val="left"/>
-            </w:pPr>
             <w:r>
               <w:rPr>
                 <w:rFonts w:ascii="Times New Roman" w:hAnsi="Times New Roman" w:eastAsia="Times New Roman"/>
@@ -3803,19 +3132,8 @@
         <w:tc>
           <w:tcPr>
             <w:tcW w:type="dxa" w:w="1872"/>
-            <w:tcBorders>
-              <w:top w:val="nil" w:sz="4" w:space="0" w:color="000000"/>
-              <w:left w:val="nil" w:sz="4" w:space="0" w:color="000000"/>
-              <w:bottom w:val="nil" w:sz="4" w:space="0" w:color="000000"/>
-              <w:right w:val="nil" w:sz="4" w:space="0" w:color="000000"/>
-              <w:insideH w:val="nil" w:sz="4" w:space="0" w:color="000000"/>
-              <w:insideV w:val="nil" w:sz="4" w:space="0" w:color="000000"/>
-            </w:tcBorders>
           </w:tcPr>
           <w:p>
-            <w:pPr>
-              <w:jc w:val="right"/>
-            </w:pPr>
             <w:r>
               <w:rPr>
                 <w:rFonts w:ascii="Times New Roman" w:hAnsi="Times New Roman" w:eastAsia="Times New Roman"/>
@@ -3829,19 +3147,8 @@
         <w:tc>
           <w:tcPr>
             <w:tcW w:type="dxa" w:w="1872"/>
-            <w:tcBorders>
-              <w:top w:val="nil" w:sz="4" w:space="0" w:color="000000"/>
-              <w:left w:val="nil" w:sz="4" w:space="0" w:color="000000"/>
-              <w:bottom w:val="nil" w:sz="4" w:space="0" w:color="000000"/>
-              <w:right w:val="nil" w:sz="4" w:space="0" w:color="000000"/>
-              <w:insideH w:val="nil" w:sz="4" w:space="0" w:color="000000"/>
-              <w:insideV w:val="nil" w:sz="4" w:space="0" w:color="000000"/>
-            </w:tcBorders>
           </w:tcPr>
           <w:p>
-            <w:pPr>
-              <w:jc w:val="left"/>
-            </w:pPr>
             <w:r>
               <w:rPr>
                 <w:rFonts w:ascii="Times New Roman" w:hAnsi="Times New Roman" w:eastAsia="Times New Roman"/>
@@ -3855,19 +3162,8 @@
         <w:tc>
           <w:tcPr>
             <w:tcW w:type="dxa" w:w="1872"/>
-            <w:tcBorders>
-              <w:top w:val="nil" w:sz="4" w:space="0" w:color="000000"/>
-              <w:left w:val="nil" w:sz="4" w:space="0" w:color="000000"/>
-              <w:bottom w:val="nil" w:sz="4" w:space="0" w:color="000000"/>
-              <w:right w:val="nil" w:sz="4" w:space="0" w:color="000000"/>
-              <w:insideH w:val="nil" w:sz="4" w:space="0" w:color="000000"/>
-              <w:insideV w:val="nil" w:sz="4" w:space="0" w:color="000000"/>
-            </w:tcBorders>
           </w:tcPr>
           <w:p>
-            <w:pPr>
-              <w:jc w:val="left"/>
-            </w:pPr>
             <w:r>
               <w:rPr>
                 <w:rFonts w:ascii="Times New Roman" w:hAnsi="Times New Roman" w:eastAsia="Times New Roman"/>
@@ -3883,19 +3179,8 @@
         <w:tc>
           <w:tcPr>
             <w:tcW w:type="dxa" w:w="1872"/>
-            <w:tcBorders>
-              <w:top w:val="nil" w:sz="4" w:space="0" w:color="000000"/>
-              <w:left w:val="nil" w:sz="4" w:space="0" w:color="000000"/>
-              <w:bottom w:val="nil" w:sz="4" w:space="0" w:color="000000"/>
-              <w:right w:val="nil" w:sz="4" w:space="0" w:color="000000"/>
-              <w:insideH w:val="nil" w:sz="4" w:space="0" w:color="000000"/>
-              <w:insideV w:val="nil" w:sz="4" w:space="0" w:color="000000"/>
-            </w:tcBorders>
           </w:tcPr>
           <w:p>
-            <w:pPr>
-              <w:jc w:val="left"/>
-            </w:pPr>
             <w:r>
               <w:rPr>
                 <w:rFonts w:ascii="Times New Roman" w:hAnsi="Times New Roman" w:eastAsia="Times New Roman"/>
@@ -3909,19 +3194,8 @@
         <w:tc>
           <w:tcPr>
             <w:tcW w:type="dxa" w:w="1872"/>
-            <w:tcBorders>
-              <w:top w:val="nil" w:sz="4" w:space="0" w:color="000000"/>
-              <w:left w:val="nil" w:sz="4" w:space="0" w:color="000000"/>
-              <w:bottom w:val="nil" w:sz="4" w:space="0" w:color="000000"/>
-              <w:right w:val="nil" w:sz="4" w:space="0" w:color="000000"/>
-              <w:insideH w:val="nil" w:sz="4" w:space="0" w:color="000000"/>
-              <w:insideV w:val="nil" w:sz="4" w:space="0" w:color="000000"/>
-            </w:tcBorders>
           </w:tcPr>
           <w:p>
-            <w:pPr>
-              <w:jc w:val="left"/>
-            </w:pPr>
             <w:r>
               <w:rPr>
                 <w:rFonts w:ascii="Times New Roman" w:hAnsi="Times New Roman" w:eastAsia="Times New Roman"/>
@@ -3935,19 +3209,8 @@
         <w:tc>
           <w:tcPr>
             <w:tcW w:type="dxa" w:w="1872"/>
-            <w:tcBorders>
-              <w:top w:val="nil" w:sz="4" w:space="0" w:color="000000"/>
-              <w:left w:val="nil" w:sz="4" w:space="0" w:color="000000"/>
-              <w:bottom w:val="nil" w:sz="4" w:space="0" w:color="000000"/>
-              <w:right w:val="nil" w:sz="4" w:space="0" w:color="000000"/>
-              <w:insideH w:val="nil" w:sz="4" w:space="0" w:color="000000"/>
-              <w:insideV w:val="nil" w:sz="4" w:space="0" w:color="000000"/>
-            </w:tcBorders>
           </w:tcPr>
           <w:p>
-            <w:pPr>
-              <w:jc w:val="right"/>
-            </w:pPr>
             <w:r>
               <w:rPr>
                 <w:rFonts w:ascii="Times New Roman" w:hAnsi="Times New Roman" w:eastAsia="Times New Roman"/>
@@ -3961,19 +3224,8 @@
         <w:tc>
           <w:tcPr>
             <w:tcW w:type="dxa" w:w="1872"/>
-            <w:tcBorders>
-              <w:top w:val="nil" w:sz="4" w:space="0" w:color="000000"/>
-              <w:left w:val="nil" w:sz="4" w:space="0" w:color="000000"/>
-              <w:bottom w:val="nil" w:sz="4" w:space="0" w:color="000000"/>
-              <w:right w:val="nil" w:sz="4" w:space="0" w:color="000000"/>
-              <w:insideH w:val="nil" w:sz="4" w:space="0" w:color="000000"/>
-              <w:insideV w:val="nil" w:sz="4" w:space="0" w:color="000000"/>
-            </w:tcBorders>
           </w:tcPr>
           <w:p>
-            <w:pPr>
-              <w:jc w:val="left"/>
-            </w:pPr>
             <w:r>
               <w:rPr>
                 <w:rFonts w:ascii="Times New Roman" w:hAnsi="Times New Roman" w:eastAsia="Times New Roman"/>
@@ -3987,19 +3239,8 @@
         <w:tc>
           <w:tcPr>
             <w:tcW w:type="dxa" w:w="1872"/>
-            <w:tcBorders>
-              <w:top w:val="nil" w:sz="4" w:space="0" w:color="000000"/>
-              <w:left w:val="nil" w:sz="4" w:space="0" w:color="000000"/>
-              <w:bottom w:val="nil" w:sz="4" w:space="0" w:color="000000"/>
-              <w:right w:val="nil" w:sz="4" w:space="0" w:color="000000"/>
-              <w:insideH w:val="nil" w:sz="4" w:space="0" w:color="000000"/>
-              <w:insideV w:val="nil" w:sz="4" w:space="0" w:color="000000"/>
-            </w:tcBorders>
           </w:tcPr>
           <w:p>
-            <w:pPr>
-              <w:jc w:val="left"/>
-            </w:pPr>
             <w:r>
               <w:rPr>
                 <w:rFonts w:ascii="Times New Roman" w:hAnsi="Times New Roman" w:eastAsia="Times New Roman"/>
@@ -4015,19 +3256,8 @@
         <w:tc>
           <w:tcPr>
             <w:tcW w:type="dxa" w:w="1872"/>
-            <w:tcBorders>
-              <w:top w:val="nil" w:sz="4" w:space="0" w:color="000000"/>
-              <w:left w:val="nil" w:sz="4" w:space="0" w:color="000000"/>
-              <w:bottom w:val="nil" w:sz="4" w:space="0" w:color="000000"/>
-              <w:right w:val="nil" w:sz="4" w:space="0" w:color="000000"/>
-              <w:insideH w:val="nil" w:sz="4" w:space="0" w:color="000000"/>
-              <w:insideV w:val="nil" w:sz="4" w:space="0" w:color="000000"/>
-            </w:tcBorders>
           </w:tcPr>
           <w:p>
-            <w:pPr>
-              <w:jc w:val="left"/>
-            </w:pPr>
             <w:r>
               <w:rPr>
                 <w:rFonts w:ascii="Times New Roman" w:hAnsi="Times New Roman" w:eastAsia="Times New Roman"/>
@@ -4041,19 +3271,8 @@
         <w:tc>
           <w:tcPr>
             <w:tcW w:type="dxa" w:w="1872"/>
-            <w:tcBorders>
-              <w:top w:val="nil" w:sz="4" w:space="0" w:color="000000"/>
-              <w:left w:val="nil" w:sz="4" w:space="0" w:color="000000"/>
-              <w:bottom w:val="nil" w:sz="4" w:space="0" w:color="000000"/>
-              <w:right w:val="nil" w:sz="4" w:space="0" w:color="000000"/>
-              <w:insideH w:val="nil" w:sz="4" w:space="0" w:color="000000"/>
-              <w:insideV w:val="nil" w:sz="4" w:space="0" w:color="000000"/>
-            </w:tcBorders>
           </w:tcPr>
           <w:p>
-            <w:pPr>
-              <w:jc w:val="left"/>
-            </w:pPr>
             <w:r>
               <w:rPr>
                 <w:rFonts w:ascii="Times New Roman" w:hAnsi="Times New Roman" w:eastAsia="Times New Roman"/>
@@ -4067,19 +3286,8 @@
         <w:tc>
           <w:tcPr>
             <w:tcW w:type="dxa" w:w="1872"/>
-            <w:tcBorders>
-              <w:top w:val="nil" w:sz="4" w:space="0" w:color="000000"/>
-              <w:left w:val="nil" w:sz="4" w:space="0" w:color="000000"/>
-              <w:bottom w:val="nil" w:sz="4" w:space="0" w:color="000000"/>
-              <w:right w:val="nil" w:sz="4" w:space="0" w:color="000000"/>
-              <w:insideH w:val="nil" w:sz="4" w:space="0" w:color="000000"/>
-              <w:insideV w:val="nil" w:sz="4" w:space="0" w:color="000000"/>
-            </w:tcBorders>
           </w:tcPr>
           <w:p>
-            <w:pPr>
-              <w:jc w:val="right"/>
-            </w:pPr>
             <w:r>
               <w:rPr>
                 <w:rFonts w:ascii="Times New Roman" w:hAnsi="Times New Roman" w:eastAsia="Times New Roman"/>
@@ -4093,19 +3301,8 @@
         <w:tc>
           <w:tcPr>
             <w:tcW w:type="dxa" w:w="1872"/>
-            <w:tcBorders>
-              <w:top w:val="nil" w:sz="4" w:space="0" w:color="000000"/>
-              <w:left w:val="nil" w:sz="4" w:space="0" w:color="000000"/>
-              <w:bottom w:val="nil" w:sz="4" w:space="0" w:color="000000"/>
-              <w:right w:val="nil" w:sz="4" w:space="0" w:color="000000"/>
-              <w:insideH w:val="nil" w:sz="4" w:space="0" w:color="000000"/>
-              <w:insideV w:val="nil" w:sz="4" w:space="0" w:color="000000"/>
-            </w:tcBorders>
           </w:tcPr>
           <w:p>
-            <w:pPr>
-              <w:jc w:val="left"/>
-            </w:pPr>
             <w:r>
               <w:rPr>
                 <w:rFonts w:ascii="Times New Roman" w:hAnsi="Times New Roman" w:eastAsia="Times New Roman"/>
@@ -4119,19 +3316,8 @@
         <w:tc>
           <w:tcPr>
             <w:tcW w:type="dxa" w:w="1872"/>
-            <w:tcBorders>
-              <w:top w:val="nil" w:sz="4" w:space="0" w:color="000000"/>
-              <w:left w:val="nil" w:sz="4" w:space="0" w:color="000000"/>
-              <w:bottom w:val="nil" w:sz="4" w:space="0" w:color="000000"/>
-              <w:right w:val="nil" w:sz="4" w:space="0" w:color="000000"/>
-              <w:insideH w:val="nil" w:sz="4" w:space="0" w:color="000000"/>
-              <w:insideV w:val="nil" w:sz="4" w:space="0" w:color="000000"/>
-            </w:tcBorders>
           </w:tcPr>
           <w:p>
-            <w:pPr>
-              <w:jc w:val="left"/>
-            </w:pPr>
             <w:r>
               <w:rPr>
                 <w:rFonts w:ascii="Times New Roman" w:hAnsi="Times New Roman" w:eastAsia="Times New Roman"/>
@@ -4147,19 +3333,8 @@
         <w:tc>
           <w:tcPr>
             <w:tcW w:type="dxa" w:w="1872"/>
-            <w:tcBorders>
-              <w:top w:val="nil" w:sz="4" w:space="0" w:color="000000"/>
-              <w:left w:val="nil" w:sz="4" w:space="0" w:color="000000"/>
-              <w:bottom w:val="nil" w:sz="4" w:space="0" w:color="000000"/>
-              <w:right w:val="nil" w:sz="4" w:space="0" w:color="000000"/>
-              <w:insideH w:val="nil" w:sz="4" w:space="0" w:color="000000"/>
-              <w:insideV w:val="nil" w:sz="4" w:space="0" w:color="000000"/>
-            </w:tcBorders>
           </w:tcPr>
           <w:p>
-            <w:pPr>
-              <w:jc w:val="left"/>
-            </w:pPr>
             <w:r>
               <w:rPr>
                 <w:rFonts w:ascii="Times New Roman" w:hAnsi="Times New Roman" w:eastAsia="Times New Roman"/>
@@ -4173,19 +3348,8 @@
         <w:tc>
           <w:tcPr>
             <w:tcW w:type="dxa" w:w="1872"/>
-            <w:tcBorders>
-              <w:top w:val="nil" w:sz="4" w:space="0" w:color="000000"/>
-              <w:left w:val="nil" w:sz="4" w:space="0" w:color="000000"/>
-              <w:bottom w:val="nil" w:sz="4" w:space="0" w:color="000000"/>
-              <w:right w:val="nil" w:sz="4" w:space="0" w:color="000000"/>
-              <w:insideH w:val="nil" w:sz="4" w:space="0" w:color="000000"/>
-              <w:insideV w:val="nil" w:sz="4" w:space="0" w:color="000000"/>
-            </w:tcBorders>
           </w:tcPr>
           <w:p>
-            <w:pPr>
-              <w:jc w:val="left"/>
-            </w:pPr>
             <w:r>
               <w:rPr>
                 <w:rFonts w:ascii="Times New Roman" w:hAnsi="Times New Roman" w:eastAsia="Times New Roman"/>
@@ -4199,19 +3363,8 @@
         <w:tc>
           <w:tcPr>
             <w:tcW w:type="dxa" w:w="1872"/>
-            <w:tcBorders>
-              <w:top w:val="nil" w:sz="4" w:space="0" w:color="000000"/>
-              <w:left w:val="nil" w:sz="4" w:space="0" w:color="000000"/>
-              <w:bottom w:val="nil" w:sz="4" w:space="0" w:color="000000"/>
-              <w:right w:val="nil" w:sz="4" w:space="0" w:color="000000"/>
-              <w:insideH w:val="nil" w:sz="4" w:space="0" w:color="000000"/>
-              <w:insideV w:val="nil" w:sz="4" w:space="0" w:color="000000"/>
-            </w:tcBorders>
           </w:tcPr>
           <w:p>
-            <w:pPr>
-              <w:jc w:val="right"/>
-            </w:pPr>
             <w:r>
               <w:rPr>
                 <w:rFonts w:ascii="Times New Roman" w:hAnsi="Times New Roman" w:eastAsia="Times New Roman"/>
@@ -4225,19 +3378,8 @@
         <w:tc>
           <w:tcPr>
             <w:tcW w:type="dxa" w:w="1872"/>
-            <w:tcBorders>
-              <w:top w:val="nil" w:sz="4" w:space="0" w:color="000000"/>
-              <w:left w:val="nil" w:sz="4" w:space="0" w:color="000000"/>
-              <w:bottom w:val="nil" w:sz="4" w:space="0" w:color="000000"/>
-              <w:right w:val="nil" w:sz="4" w:space="0" w:color="000000"/>
-              <w:insideH w:val="nil" w:sz="4" w:space="0" w:color="000000"/>
-              <w:insideV w:val="nil" w:sz="4" w:space="0" w:color="000000"/>
-            </w:tcBorders>
           </w:tcPr>
           <w:p>
-            <w:pPr>
-              <w:jc w:val="left"/>
-            </w:pPr>
             <w:r>
               <w:rPr>
                 <w:rFonts w:ascii="Times New Roman" w:hAnsi="Times New Roman" w:eastAsia="Times New Roman"/>
@@ -4251,19 +3393,8 @@
         <w:tc>
           <w:tcPr>
             <w:tcW w:type="dxa" w:w="1872"/>
-            <w:tcBorders>
-              <w:top w:val="nil" w:sz="4" w:space="0" w:color="000000"/>
-              <w:left w:val="nil" w:sz="4" w:space="0" w:color="000000"/>
-              <w:bottom w:val="nil" w:sz="4" w:space="0" w:color="000000"/>
-              <w:right w:val="nil" w:sz="4" w:space="0" w:color="000000"/>
-              <w:insideH w:val="nil" w:sz="4" w:space="0" w:color="000000"/>
-              <w:insideV w:val="nil" w:sz="4" w:space="0" w:color="000000"/>
-            </w:tcBorders>
           </w:tcPr>
           <w:p>
-            <w:pPr>
-              <w:jc w:val="left"/>
-            </w:pPr>
             <w:r>
               <w:rPr>
                 <w:rFonts w:ascii="Times New Roman" w:hAnsi="Times New Roman" w:eastAsia="Times New Roman"/>
@@ -4279,19 +3410,8 @@
         <w:tc>
           <w:tcPr>
             <w:tcW w:type="dxa" w:w="1872"/>
-            <w:tcBorders>
-              <w:top w:val="nil" w:sz="4" w:space="0" w:color="000000"/>
-              <w:left w:val="nil" w:sz="4" w:space="0" w:color="000000"/>
-              <w:bottom w:val="nil" w:sz="4" w:space="0" w:color="000000"/>
-              <w:right w:val="nil" w:sz="4" w:space="0" w:color="000000"/>
-              <w:insideH w:val="nil" w:sz="4" w:space="0" w:color="000000"/>
-              <w:insideV w:val="nil" w:sz="4" w:space="0" w:color="000000"/>
-            </w:tcBorders>
           </w:tcPr>
           <w:p>
-            <w:pPr>
-              <w:jc w:val="left"/>
-            </w:pPr>
             <w:r>
               <w:rPr>
                 <w:rFonts w:ascii="Times New Roman" w:hAnsi="Times New Roman" w:eastAsia="Times New Roman"/>
@@ -4305,19 +3425,8 @@
         <w:tc>
           <w:tcPr>
             <w:tcW w:type="dxa" w:w="1872"/>
-            <w:tcBorders>
-              <w:top w:val="nil" w:sz="4" w:space="0" w:color="000000"/>
-              <w:left w:val="nil" w:sz="4" w:space="0" w:color="000000"/>
-              <w:bottom w:val="nil" w:sz="4" w:space="0" w:color="000000"/>
-              <w:right w:val="nil" w:sz="4" w:space="0" w:color="000000"/>
-              <w:insideH w:val="nil" w:sz="4" w:space="0" w:color="000000"/>
-              <w:insideV w:val="nil" w:sz="4" w:space="0" w:color="000000"/>
-            </w:tcBorders>
           </w:tcPr>
           <w:p>
-            <w:pPr>
-              <w:jc w:val="left"/>
-            </w:pPr>
             <w:r>
               <w:rPr>
                 <w:rFonts w:ascii="Times New Roman" w:hAnsi="Times New Roman" w:eastAsia="Times New Roman"/>
@@ -4331,19 +3440,8 @@
         <w:tc>
           <w:tcPr>
             <w:tcW w:type="dxa" w:w="1872"/>
-            <w:tcBorders>
-              <w:top w:val="nil" w:sz="4" w:space="0" w:color="000000"/>
-              <w:left w:val="nil" w:sz="4" w:space="0" w:color="000000"/>
-              <w:bottom w:val="nil" w:sz="4" w:space="0" w:color="000000"/>
-              <w:right w:val="nil" w:sz="4" w:space="0" w:color="000000"/>
-              <w:insideH w:val="nil" w:sz="4" w:space="0" w:color="000000"/>
-              <w:insideV w:val="nil" w:sz="4" w:space="0" w:color="000000"/>
-            </w:tcBorders>
           </w:tcPr>
           <w:p>
-            <w:pPr>
-              <w:jc w:val="right"/>
-            </w:pPr>
             <w:r>
               <w:rPr>
                 <w:rFonts w:ascii="Times New Roman" w:hAnsi="Times New Roman" w:eastAsia="Times New Roman"/>
@@ -4357,19 +3455,8 @@
         <w:tc>
           <w:tcPr>
             <w:tcW w:type="dxa" w:w="1872"/>
-            <w:tcBorders>
-              <w:top w:val="nil" w:sz="4" w:space="0" w:color="000000"/>
-              <w:left w:val="nil" w:sz="4" w:space="0" w:color="000000"/>
-              <w:bottom w:val="nil" w:sz="4" w:space="0" w:color="000000"/>
-              <w:right w:val="nil" w:sz="4" w:space="0" w:color="000000"/>
-              <w:insideH w:val="nil" w:sz="4" w:space="0" w:color="000000"/>
-              <w:insideV w:val="nil" w:sz="4" w:space="0" w:color="000000"/>
-            </w:tcBorders>
           </w:tcPr>
           <w:p>
-            <w:pPr>
-              <w:jc w:val="left"/>
-            </w:pPr>
             <w:r>
               <w:rPr>
                 <w:rFonts w:ascii="Times New Roman" w:hAnsi="Times New Roman" w:eastAsia="Times New Roman"/>
@@ -4383,19 +3470,8 @@
         <w:tc>
           <w:tcPr>
             <w:tcW w:type="dxa" w:w="1872"/>
-            <w:tcBorders>
-              <w:top w:val="nil" w:sz="4" w:space="0" w:color="000000"/>
-              <w:left w:val="nil" w:sz="4" w:space="0" w:color="000000"/>
-              <w:bottom w:val="nil" w:sz="4" w:space="0" w:color="000000"/>
-              <w:right w:val="nil" w:sz="4" w:space="0" w:color="000000"/>
-              <w:insideH w:val="nil" w:sz="4" w:space="0" w:color="000000"/>
-              <w:insideV w:val="nil" w:sz="4" w:space="0" w:color="000000"/>
-            </w:tcBorders>
           </w:tcPr>
           <w:p>
-            <w:pPr>
-              <w:jc w:val="left"/>
-            </w:pPr>
             <w:r>
               <w:rPr>
                 <w:rFonts w:ascii="Times New Roman" w:hAnsi="Times New Roman" w:eastAsia="Times New Roman"/>
@@ -4411,19 +3487,8 @@
         <w:tc>
           <w:tcPr>
             <w:tcW w:type="dxa" w:w="1872"/>
-            <w:tcBorders>
-              <w:top w:val="nil" w:sz="4" w:space="0" w:color="000000"/>
-              <w:left w:val="nil" w:sz="4" w:space="0" w:color="000000"/>
-              <w:bottom w:val="nil" w:sz="4" w:space="0" w:color="000000"/>
-              <w:right w:val="nil" w:sz="4" w:space="0" w:color="000000"/>
-              <w:insideH w:val="nil" w:sz="4" w:space="0" w:color="000000"/>
-              <w:insideV w:val="nil" w:sz="4" w:space="0" w:color="000000"/>
-            </w:tcBorders>
           </w:tcPr>
           <w:p>
-            <w:pPr>
-              <w:jc w:val="left"/>
-            </w:pPr>
             <w:r>
               <w:rPr>
                 <w:rFonts w:ascii="Times New Roman" w:hAnsi="Times New Roman" w:eastAsia="Times New Roman"/>
@@ -4437,19 +3502,8 @@
         <w:tc>
           <w:tcPr>
             <w:tcW w:type="dxa" w:w="1872"/>
-            <w:tcBorders>
-              <w:top w:val="nil" w:sz="4" w:space="0" w:color="000000"/>
-              <w:left w:val="nil" w:sz="4" w:space="0" w:color="000000"/>
-              <w:bottom w:val="nil" w:sz="4" w:space="0" w:color="000000"/>
-              <w:right w:val="nil" w:sz="4" w:space="0" w:color="000000"/>
-              <w:insideH w:val="nil" w:sz="4" w:space="0" w:color="000000"/>
-              <w:insideV w:val="nil" w:sz="4" w:space="0" w:color="000000"/>
-            </w:tcBorders>
           </w:tcPr>
           <w:p>
-            <w:pPr>
-              <w:jc w:val="left"/>
-            </w:pPr>
             <w:r>
               <w:rPr>
                 <w:rFonts w:ascii="Times New Roman" w:hAnsi="Times New Roman" w:eastAsia="Times New Roman"/>
@@ -4463,19 +3517,8 @@
         <w:tc>
           <w:tcPr>
             <w:tcW w:type="dxa" w:w="1872"/>
-            <w:tcBorders>
-              <w:top w:val="nil" w:sz="4" w:space="0" w:color="000000"/>
-              <w:left w:val="nil" w:sz="4" w:space="0" w:color="000000"/>
-              <w:bottom w:val="nil" w:sz="4" w:space="0" w:color="000000"/>
-              <w:right w:val="nil" w:sz="4" w:space="0" w:color="000000"/>
-              <w:insideH w:val="nil" w:sz="4" w:space="0" w:color="000000"/>
-              <w:insideV w:val="nil" w:sz="4" w:space="0" w:color="000000"/>
-            </w:tcBorders>
           </w:tcPr>
           <w:p>
-            <w:pPr>
-              <w:jc w:val="right"/>
-            </w:pPr>
             <w:r>
               <w:rPr>
                 <w:rFonts w:ascii="Times New Roman" w:hAnsi="Times New Roman" w:eastAsia="Times New Roman"/>
@@ -4489,19 +3532,8 @@
         <w:tc>
           <w:tcPr>
             <w:tcW w:type="dxa" w:w="1872"/>
-            <w:tcBorders>
-              <w:top w:val="nil" w:sz="4" w:space="0" w:color="000000"/>
-              <w:left w:val="nil" w:sz="4" w:space="0" w:color="000000"/>
-              <w:bottom w:val="nil" w:sz="4" w:space="0" w:color="000000"/>
-              <w:right w:val="nil" w:sz="4" w:space="0" w:color="000000"/>
-              <w:insideH w:val="nil" w:sz="4" w:space="0" w:color="000000"/>
-              <w:insideV w:val="nil" w:sz="4" w:space="0" w:color="000000"/>
-            </w:tcBorders>
           </w:tcPr>
           <w:p>
-            <w:pPr>
-              <w:jc w:val="left"/>
-            </w:pPr>
             <w:r>
               <w:rPr>
                 <w:rFonts w:ascii="Times New Roman" w:hAnsi="Times New Roman" w:eastAsia="Times New Roman"/>
@@ -4515,19 +3547,8 @@
         <w:tc>
           <w:tcPr>
             <w:tcW w:type="dxa" w:w="1872"/>
-            <w:tcBorders>
-              <w:top w:val="nil" w:sz="4" w:space="0" w:color="000000"/>
-              <w:left w:val="nil" w:sz="4" w:space="0" w:color="000000"/>
-              <w:bottom w:val="nil" w:sz="4" w:space="0" w:color="000000"/>
-              <w:right w:val="nil" w:sz="4" w:space="0" w:color="000000"/>
-              <w:insideH w:val="nil" w:sz="4" w:space="0" w:color="000000"/>
-              <w:insideV w:val="nil" w:sz="4" w:space="0" w:color="000000"/>
-            </w:tcBorders>
           </w:tcPr>
           <w:p>
-            <w:pPr>
-              <w:jc w:val="left"/>
-            </w:pPr>
             <w:r>
               <w:rPr>
                 <w:rFonts w:ascii="Times New Roman" w:hAnsi="Times New Roman" w:eastAsia="Times New Roman"/>
@@ -4543,19 +3564,8 @@
         <w:tc>
           <w:tcPr>
             <w:tcW w:type="dxa" w:w="1872"/>
-            <w:tcBorders>
-              <w:top w:val="nil" w:sz="4" w:space="0" w:color="000000"/>
-              <w:left w:val="nil" w:sz="4" w:space="0" w:color="000000"/>
-              <w:bottom w:val="single" w:sz="4" w:space="0" w:color="000000"/>
-              <w:right w:val="nil" w:sz="4" w:space="0" w:color="000000"/>
-              <w:insideH w:val="nil" w:sz="4" w:space="0" w:color="000000"/>
-              <w:insideV w:val="nil" w:sz="4" w:space="0" w:color="000000"/>
-            </w:tcBorders>
           </w:tcPr>
           <w:p>
-            <w:pPr>
-              <w:jc w:val="left"/>
-            </w:pPr>
             <w:r>
               <w:rPr>
                 <w:rFonts w:ascii="Times New Roman" w:hAnsi="Times New Roman" w:eastAsia="Times New Roman"/>
@@ -4569,19 +3579,8 @@
         <w:tc>
           <w:tcPr>
             <w:tcW w:type="dxa" w:w="1872"/>
-            <w:tcBorders>
-              <w:top w:val="nil" w:sz="4" w:space="0" w:color="000000"/>
-              <w:left w:val="nil" w:sz="4" w:space="0" w:color="000000"/>
-              <w:bottom w:val="single" w:sz="4" w:space="0" w:color="000000"/>
-              <w:right w:val="nil" w:sz="4" w:space="0" w:color="000000"/>
-              <w:insideH w:val="nil" w:sz="4" w:space="0" w:color="000000"/>
-              <w:insideV w:val="nil" w:sz="4" w:space="0" w:color="000000"/>
-            </w:tcBorders>
           </w:tcPr>
           <w:p>
-            <w:pPr>
-              <w:jc w:val="left"/>
-            </w:pPr>
             <w:r>
               <w:rPr>
                 <w:rFonts w:ascii="Times New Roman" w:hAnsi="Times New Roman" w:eastAsia="Times New Roman"/>
@@ -4595,19 +3594,8 @@
         <w:tc>
           <w:tcPr>
             <w:tcW w:type="dxa" w:w="1872"/>
-            <w:tcBorders>
-              <w:top w:val="nil" w:sz="4" w:space="0" w:color="000000"/>
-              <w:left w:val="nil" w:sz="4" w:space="0" w:color="000000"/>
-              <w:bottom w:val="single" w:sz="4" w:space="0" w:color="000000"/>
-              <w:right w:val="nil" w:sz="4" w:space="0" w:color="000000"/>
-              <w:insideH w:val="nil" w:sz="4" w:space="0" w:color="000000"/>
-              <w:insideV w:val="nil" w:sz="4" w:space="0" w:color="000000"/>
-            </w:tcBorders>
           </w:tcPr>
           <w:p>
-            <w:pPr>
-              <w:jc w:val="right"/>
-            </w:pPr>
             <w:r>
               <w:rPr>
                 <w:rFonts w:ascii="Times New Roman" w:hAnsi="Times New Roman" w:eastAsia="Times New Roman"/>
@@ -4621,19 +3609,8 @@
         <w:tc>
           <w:tcPr>
             <w:tcW w:type="dxa" w:w="1872"/>
-            <w:tcBorders>
-              <w:top w:val="nil" w:sz="4" w:space="0" w:color="000000"/>
-              <w:left w:val="nil" w:sz="4" w:space="0" w:color="000000"/>
-              <w:bottom w:val="single" w:sz="4" w:space="0" w:color="000000"/>
-              <w:right w:val="nil" w:sz="4" w:space="0" w:color="000000"/>
-              <w:insideH w:val="nil" w:sz="4" w:space="0" w:color="000000"/>
-              <w:insideV w:val="nil" w:sz="4" w:space="0" w:color="000000"/>
-            </w:tcBorders>
           </w:tcPr>
           <w:p>
-            <w:pPr>
-              <w:jc w:val="left"/>
-            </w:pPr>
             <w:r>
               <w:rPr>
                 <w:rFonts w:ascii="Times New Roman" w:hAnsi="Times New Roman" w:eastAsia="Times New Roman"/>
@@ -4647,19 +3624,8 @@
         <w:tc>
           <w:tcPr>
             <w:tcW w:type="dxa" w:w="1872"/>
-            <w:tcBorders>
-              <w:top w:val="nil" w:sz="4" w:space="0" w:color="000000"/>
-              <w:left w:val="nil" w:sz="4" w:space="0" w:color="000000"/>
-              <w:bottom w:val="single" w:sz="4" w:space="0" w:color="000000"/>
-              <w:right w:val="nil" w:sz="4" w:space="0" w:color="000000"/>
-              <w:insideH w:val="nil" w:sz="4" w:space="0" w:color="000000"/>
-              <w:insideV w:val="nil" w:sz="4" w:space="0" w:color="000000"/>
-            </w:tcBorders>
           </w:tcPr>
           <w:p>
-            <w:pPr>
-              <w:jc w:val="left"/>
-            </w:pPr>
             <w:r>
               <w:rPr>
                 <w:rFonts w:ascii="Times New Roman" w:hAnsi="Times New Roman" w:eastAsia="Times New Roman"/>
@@ -4831,19 +3797,8 @@
         <w:tc>
           <w:tcPr>
             <w:tcW w:type="dxa" w:w="2340"/>
-            <w:tcBorders>
-              <w:top w:val="single" w:sz="4" w:space="0" w:color="000000"/>
-              <w:left w:val="nil" w:sz="4" w:space="0" w:color="000000"/>
-              <w:bottom w:val="single" w:sz="4" w:space="0" w:color="000000"/>
-              <w:right w:val="nil" w:sz="4" w:space="0" w:color="000000"/>
-              <w:insideH w:val="nil" w:sz="4" w:space="0" w:color="000000"/>
-              <w:insideV w:val="nil" w:sz="4" w:space="0" w:color="000000"/>
-            </w:tcBorders>
           </w:tcPr>
           <w:p>
-            <w:pPr>
-              <w:jc w:val="center"/>
-            </w:pPr>
             <w:r>
               <w:rPr>
                 <w:rFonts w:ascii="Times New Roman" w:hAnsi="Times New Roman" w:eastAsia="Times New Roman"/>
@@ -4857,19 +3812,8 @@
         <w:tc>
           <w:tcPr>
             <w:tcW w:type="dxa" w:w="2340"/>
-            <w:tcBorders>
-              <w:top w:val="single" w:sz="4" w:space="0" w:color="000000"/>
-              <w:left w:val="nil" w:sz="4" w:space="0" w:color="000000"/>
-              <w:bottom w:val="single" w:sz="4" w:space="0" w:color="000000"/>
-              <w:right w:val="nil" w:sz="4" w:space="0" w:color="000000"/>
-              <w:insideH w:val="nil" w:sz="4" w:space="0" w:color="000000"/>
-              <w:insideV w:val="nil" w:sz="4" w:space="0" w:color="000000"/>
-            </w:tcBorders>
           </w:tcPr>
           <w:p>
-            <w:pPr>
-              <w:jc w:val="center"/>
-            </w:pPr>
             <w:r>
               <w:rPr>
                 <w:rFonts w:ascii="Times New Roman" w:hAnsi="Times New Roman" w:eastAsia="Times New Roman"/>
@@ -4883,19 +3827,8 @@
         <w:tc>
           <w:tcPr>
             <w:tcW w:type="dxa" w:w="2340"/>
-            <w:tcBorders>
-              <w:top w:val="single" w:sz="4" w:space="0" w:color="000000"/>
-              <w:left w:val="nil" w:sz="4" w:space="0" w:color="000000"/>
-              <w:bottom w:val="single" w:sz="4" w:space="0" w:color="000000"/>
-              <w:right w:val="nil" w:sz="4" w:space="0" w:color="000000"/>
-              <w:insideH w:val="nil" w:sz="4" w:space="0" w:color="000000"/>
-              <w:insideV w:val="nil" w:sz="4" w:space="0" w:color="000000"/>
-            </w:tcBorders>
           </w:tcPr>
           <w:p>
-            <w:pPr>
-              <w:jc w:val="center"/>
-            </w:pPr>
             <w:r>
               <w:rPr>
                 <w:rFonts w:ascii="Times New Roman" w:hAnsi="Times New Roman" w:eastAsia="Times New Roman"/>
@@ -4909,19 +3842,8 @@
         <w:tc>
           <w:tcPr>
             <w:tcW w:type="dxa" w:w="2340"/>
-            <w:tcBorders>
-              <w:top w:val="single" w:sz="4" w:space="0" w:color="000000"/>
-              <w:left w:val="nil" w:sz="4" w:space="0" w:color="000000"/>
-              <w:bottom w:val="single" w:sz="4" w:space="0" w:color="000000"/>
-              <w:right w:val="nil" w:sz="4" w:space="0" w:color="000000"/>
-              <w:insideH w:val="nil" w:sz="4" w:space="0" w:color="000000"/>
-              <w:insideV w:val="nil" w:sz="4" w:space="0" w:color="000000"/>
-            </w:tcBorders>
           </w:tcPr>
           <w:p>
-            <w:pPr>
-              <w:jc w:val="center"/>
-            </w:pPr>
             <w:r>
               <w:rPr>
                 <w:rFonts w:ascii="Times New Roman" w:hAnsi="Times New Roman" w:eastAsia="Times New Roman"/>
@@ -4937,19 +3859,8 @@
         <w:tc>
           <w:tcPr>
             <w:tcW w:type="dxa" w:w="2340"/>
-            <w:tcBorders>
-              <w:top w:val="nil" w:sz="4" w:space="0" w:color="000000"/>
-              <w:left w:val="nil" w:sz="4" w:space="0" w:color="000000"/>
-              <w:bottom w:val="nil" w:sz="4" w:space="0" w:color="000000"/>
-              <w:right w:val="nil" w:sz="4" w:space="0" w:color="000000"/>
-              <w:insideH w:val="nil" w:sz="4" w:space="0" w:color="000000"/>
-              <w:insideV w:val="nil" w:sz="4" w:space="0" w:color="000000"/>
-            </w:tcBorders>
           </w:tcPr>
           <w:p>
-            <w:pPr>
-              <w:jc w:val="left"/>
-            </w:pPr>
             <w:r>
               <w:rPr>
                 <w:rFonts w:ascii="Times New Roman" w:hAnsi="Times New Roman" w:eastAsia="Times New Roman"/>
@@ -4963,19 +3874,8 @@
         <w:tc>
           <w:tcPr>
             <w:tcW w:type="dxa" w:w="2340"/>
-            <w:tcBorders>
-              <w:top w:val="nil" w:sz="4" w:space="0" w:color="000000"/>
-              <w:left w:val="nil" w:sz="4" w:space="0" w:color="000000"/>
-              <w:bottom w:val="nil" w:sz="4" w:space="0" w:color="000000"/>
-              <w:right w:val="nil" w:sz="4" w:space="0" w:color="000000"/>
-              <w:insideH w:val="nil" w:sz="4" w:space="0" w:color="000000"/>
-              <w:insideV w:val="nil" w:sz="4" w:space="0" w:color="000000"/>
-            </w:tcBorders>
           </w:tcPr>
           <w:p>
-            <w:pPr>
-              <w:jc w:val="left"/>
-            </w:pPr>
             <w:r>
               <w:rPr>
                 <w:rFonts w:ascii="Times New Roman" w:hAnsi="Times New Roman" w:eastAsia="Times New Roman"/>
@@ -4989,19 +3889,8 @@
         <w:tc>
           <w:tcPr>
             <w:tcW w:type="dxa" w:w="2340"/>
-            <w:tcBorders>
-              <w:top w:val="nil" w:sz="4" w:space="0" w:color="000000"/>
-              <w:left w:val="nil" w:sz="4" w:space="0" w:color="000000"/>
-              <w:bottom w:val="nil" w:sz="4" w:space="0" w:color="000000"/>
-              <w:right w:val="nil" w:sz="4" w:space="0" w:color="000000"/>
-              <w:insideH w:val="nil" w:sz="4" w:space="0" w:color="000000"/>
-              <w:insideV w:val="nil" w:sz="4" w:space="0" w:color="000000"/>
-            </w:tcBorders>
           </w:tcPr>
           <w:p>
-            <w:pPr>
-              <w:jc w:val="right"/>
-            </w:pPr>
             <w:r>
               <w:rPr>
                 <w:rFonts w:ascii="Times New Roman" w:hAnsi="Times New Roman" w:eastAsia="Times New Roman"/>
@@ -5015,19 +3904,8 @@
         <w:tc>
           <w:tcPr>
             <w:tcW w:type="dxa" w:w="2340"/>
-            <w:tcBorders>
-              <w:top w:val="nil" w:sz="4" w:space="0" w:color="000000"/>
-              <w:left w:val="nil" w:sz="4" w:space="0" w:color="000000"/>
-              <w:bottom w:val="nil" w:sz="4" w:space="0" w:color="000000"/>
-              <w:right w:val="nil" w:sz="4" w:space="0" w:color="000000"/>
-              <w:insideH w:val="nil" w:sz="4" w:space="0" w:color="000000"/>
-              <w:insideV w:val="nil" w:sz="4" w:space="0" w:color="000000"/>
-            </w:tcBorders>
           </w:tcPr>
           <w:p>
-            <w:pPr>
-              <w:jc w:val="left"/>
-            </w:pPr>
             <w:r>
               <w:rPr>
                 <w:rFonts w:ascii="Times New Roman" w:hAnsi="Times New Roman" w:eastAsia="Times New Roman"/>
@@ -5043,19 +3921,8 @@
         <w:tc>
           <w:tcPr>
             <w:tcW w:type="dxa" w:w="2340"/>
-            <w:tcBorders>
-              <w:top w:val="nil" w:sz="4" w:space="0" w:color="000000"/>
-              <w:left w:val="nil" w:sz="4" w:space="0" w:color="000000"/>
-              <w:bottom w:val="nil" w:sz="4" w:space="0" w:color="000000"/>
-              <w:right w:val="nil" w:sz="4" w:space="0" w:color="000000"/>
-              <w:insideH w:val="nil" w:sz="4" w:space="0" w:color="000000"/>
-              <w:insideV w:val="nil" w:sz="4" w:space="0" w:color="000000"/>
-            </w:tcBorders>
           </w:tcPr>
           <w:p>
-            <w:pPr>
-              <w:jc w:val="left"/>
-            </w:pPr>
             <w:r>
               <w:rPr>
                 <w:rFonts w:ascii="Times New Roman" w:hAnsi="Times New Roman" w:eastAsia="Times New Roman"/>
@@ -5069,19 +3936,8 @@
         <w:tc>
           <w:tcPr>
             <w:tcW w:type="dxa" w:w="2340"/>
-            <w:tcBorders>
-              <w:top w:val="nil" w:sz="4" w:space="0" w:color="000000"/>
-              <w:left w:val="nil" w:sz="4" w:space="0" w:color="000000"/>
-              <w:bottom w:val="nil" w:sz="4" w:space="0" w:color="000000"/>
-              <w:right w:val="nil" w:sz="4" w:space="0" w:color="000000"/>
-              <w:insideH w:val="nil" w:sz="4" w:space="0" w:color="000000"/>
-              <w:insideV w:val="nil" w:sz="4" w:space="0" w:color="000000"/>
-            </w:tcBorders>
           </w:tcPr>
           <w:p>
-            <w:pPr>
-              <w:jc w:val="left"/>
-            </w:pPr>
             <w:r>
               <w:rPr>
                 <w:rFonts w:ascii="Times New Roman" w:hAnsi="Times New Roman" w:eastAsia="Times New Roman"/>
@@ -5095,19 +3951,8 @@
         <w:tc>
           <w:tcPr>
             <w:tcW w:type="dxa" w:w="2340"/>
-            <w:tcBorders>
-              <w:top w:val="nil" w:sz="4" w:space="0" w:color="000000"/>
-              <w:left w:val="nil" w:sz="4" w:space="0" w:color="000000"/>
-              <w:bottom w:val="nil" w:sz="4" w:space="0" w:color="000000"/>
-              <w:right w:val="nil" w:sz="4" w:space="0" w:color="000000"/>
-              <w:insideH w:val="nil" w:sz="4" w:space="0" w:color="000000"/>
-              <w:insideV w:val="nil" w:sz="4" w:space="0" w:color="000000"/>
-            </w:tcBorders>
           </w:tcPr>
           <w:p>
-            <w:pPr>
-              <w:jc w:val="right"/>
-            </w:pPr>
             <w:r>
               <w:rPr>
                 <w:rFonts w:ascii="Times New Roman" w:hAnsi="Times New Roman" w:eastAsia="Times New Roman"/>
@@ -5121,19 +3966,8 @@
         <w:tc>
           <w:tcPr>
             <w:tcW w:type="dxa" w:w="2340"/>
-            <w:tcBorders>
-              <w:top w:val="nil" w:sz="4" w:space="0" w:color="000000"/>
-              <w:left w:val="nil" w:sz="4" w:space="0" w:color="000000"/>
-              <w:bottom w:val="nil" w:sz="4" w:space="0" w:color="000000"/>
-              <w:right w:val="nil" w:sz="4" w:space="0" w:color="000000"/>
-              <w:insideH w:val="nil" w:sz="4" w:space="0" w:color="000000"/>
-              <w:insideV w:val="nil" w:sz="4" w:space="0" w:color="000000"/>
-            </w:tcBorders>
           </w:tcPr>
           <w:p>
-            <w:pPr>
-              <w:jc w:val="left"/>
-            </w:pPr>
             <w:r>
               <w:rPr>
                 <w:rFonts w:ascii="Times New Roman" w:hAnsi="Times New Roman" w:eastAsia="Times New Roman"/>
@@ -5149,19 +3983,8 @@
         <w:tc>
           <w:tcPr>
             <w:tcW w:type="dxa" w:w="2340"/>
-            <w:tcBorders>
-              <w:top w:val="nil" w:sz="4" w:space="0" w:color="000000"/>
-              <w:left w:val="nil" w:sz="4" w:space="0" w:color="000000"/>
-              <w:bottom w:val="nil" w:sz="4" w:space="0" w:color="000000"/>
-              <w:right w:val="nil" w:sz="4" w:space="0" w:color="000000"/>
-              <w:insideH w:val="nil" w:sz="4" w:space="0" w:color="000000"/>
-              <w:insideV w:val="nil" w:sz="4" w:space="0" w:color="000000"/>
-            </w:tcBorders>
           </w:tcPr>
           <w:p>
-            <w:pPr>
-              <w:jc w:val="left"/>
-            </w:pPr>
             <w:r>
               <w:rPr>
                 <w:rFonts w:ascii="Times New Roman" w:hAnsi="Times New Roman" w:eastAsia="Times New Roman"/>
@@ -5175,19 +3998,8 @@
         <w:tc>
           <w:tcPr>
             <w:tcW w:type="dxa" w:w="2340"/>
-            <w:tcBorders>
-              <w:top w:val="nil" w:sz="4" w:space="0" w:color="000000"/>
-              <w:left w:val="nil" w:sz="4" w:space="0" w:color="000000"/>
-              <w:bottom w:val="nil" w:sz="4" w:space="0" w:color="000000"/>
-              <w:right w:val="nil" w:sz="4" w:space="0" w:color="000000"/>
-              <w:insideH w:val="nil" w:sz="4" w:space="0" w:color="000000"/>
-              <w:insideV w:val="nil" w:sz="4" w:space="0" w:color="000000"/>
-            </w:tcBorders>
           </w:tcPr>
           <w:p>
-            <w:pPr>
-              <w:jc w:val="left"/>
-            </w:pPr>
             <w:r>
               <w:rPr>
                 <w:rFonts w:ascii="Times New Roman" w:hAnsi="Times New Roman" w:eastAsia="Times New Roman"/>
@@ -5201,19 +4013,8 @@
         <w:tc>
           <w:tcPr>
             <w:tcW w:type="dxa" w:w="2340"/>
-            <w:tcBorders>
-              <w:top w:val="nil" w:sz="4" w:space="0" w:color="000000"/>
-              <w:left w:val="nil" w:sz="4" w:space="0" w:color="000000"/>
-              <w:bottom w:val="nil" w:sz="4" w:space="0" w:color="000000"/>
-              <w:right w:val="nil" w:sz="4" w:space="0" w:color="000000"/>
-              <w:insideH w:val="nil" w:sz="4" w:space="0" w:color="000000"/>
-              <w:insideV w:val="nil" w:sz="4" w:space="0" w:color="000000"/>
-            </w:tcBorders>
           </w:tcPr>
           <w:p>
-            <w:pPr>
-              <w:jc w:val="right"/>
-            </w:pPr>
             <w:r>
               <w:rPr>
                 <w:rFonts w:ascii="Times New Roman" w:hAnsi="Times New Roman" w:eastAsia="Times New Roman"/>
@@ -5227,19 +4028,8 @@
         <w:tc>
           <w:tcPr>
             <w:tcW w:type="dxa" w:w="2340"/>
-            <w:tcBorders>
-              <w:top w:val="nil" w:sz="4" w:space="0" w:color="000000"/>
-              <w:left w:val="nil" w:sz="4" w:space="0" w:color="000000"/>
-              <w:bottom w:val="nil" w:sz="4" w:space="0" w:color="000000"/>
-              <w:right w:val="nil" w:sz="4" w:space="0" w:color="000000"/>
-              <w:insideH w:val="nil" w:sz="4" w:space="0" w:color="000000"/>
-              <w:insideV w:val="nil" w:sz="4" w:space="0" w:color="000000"/>
-            </w:tcBorders>
           </w:tcPr>
           <w:p>
-            <w:pPr>
-              <w:jc w:val="left"/>
-            </w:pPr>
             <w:r>
               <w:rPr>
                 <w:rFonts w:ascii="Times New Roman" w:hAnsi="Times New Roman" w:eastAsia="Times New Roman"/>
@@ -5255,19 +4045,8 @@
         <w:tc>
           <w:tcPr>
             <w:tcW w:type="dxa" w:w="2340"/>
-            <w:tcBorders>
-              <w:top w:val="nil" w:sz="4" w:space="0" w:color="000000"/>
-              <w:left w:val="nil" w:sz="4" w:space="0" w:color="000000"/>
-              <w:bottom w:val="nil" w:sz="4" w:space="0" w:color="000000"/>
-              <w:right w:val="nil" w:sz="4" w:space="0" w:color="000000"/>
-              <w:insideH w:val="nil" w:sz="4" w:space="0" w:color="000000"/>
-              <w:insideV w:val="nil" w:sz="4" w:space="0" w:color="000000"/>
-            </w:tcBorders>
           </w:tcPr>
           <w:p>
-            <w:pPr>
-              <w:jc w:val="left"/>
-            </w:pPr>
             <w:r>
               <w:rPr>
                 <w:rFonts w:ascii="Times New Roman" w:hAnsi="Times New Roman" w:eastAsia="Times New Roman"/>
@@ -5281,19 +4060,8 @@
         <w:tc>
           <w:tcPr>
             <w:tcW w:type="dxa" w:w="2340"/>
-            <w:tcBorders>
-              <w:top w:val="nil" w:sz="4" w:space="0" w:color="000000"/>
-              <w:left w:val="nil" w:sz="4" w:space="0" w:color="000000"/>
-              <w:bottom w:val="nil" w:sz="4" w:space="0" w:color="000000"/>
-              <w:right w:val="nil" w:sz="4" w:space="0" w:color="000000"/>
-              <w:insideH w:val="nil" w:sz="4" w:space="0" w:color="000000"/>
-              <w:insideV w:val="nil" w:sz="4" w:space="0" w:color="000000"/>
-            </w:tcBorders>
           </w:tcPr>
           <w:p>
-            <w:pPr>
-              <w:jc w:val="left"/>
-            </w:pPr>
             <w:r>
               <w:rPr>
                 <w:rFonts w:ascii="Times New Roman" w:hAnsi="Times New Roman" w:eastAsia="Times New Roman"/>
@@ -5307,19 +4075,8 @@
         <w:tc>
           <w:tcPr>
             <w:tcW w:type="dxa" w:w="2340"/>
-            <w:tcBorders>
-              <w:top w:val="nil" w:sz="4" w:space="0" w:color="000000"/>
-              <w:left w:val="nil" w:sz="4" w:space="0" w:color="000000"/>
-              <w:bottom w:val="nil" w:sz="4" w:space="0" w:color="000000"/>
-              <w:right w:val="nil" w:sz="4" w:space="0" w:color="000000"/>
-              <w:insideH w:val="nil" w:sz="4" w:space="0" w:color="000000"/>
-              <w:insideV w:val="nil" w:sz="4" w:space="0" w:color="000000"/>
-            </w:tcBorders>
           </w:tcPr>
           <w:p>
-            <w:pPr>
-              <w:jc w:val="right"/>
-            </w:pPr>
             <w:r>
               <w:rPr>
                 <w:rFonts w:ascii="Times New Roman" w:hAnsi="Times New Roman" w:eastAsia="Times New Roman"/>
@@ -5333,19 +4090,8 @@
         <w:tc>
           <w:tcPr>
             <w:tcW w:type="dxa" w:w="2340"/>
-            <w:tcBorders>
-              <w:top w:val="nil" w:sz="4" w:space="0" w:color="000000"/>
-              <w:left w:val="nil" w:sz="4" w:space="0" w:color="000000"/>
-              <w:bottom w:val="nil" w:sz="4" w:space="0" w:color="000000"/>
-              <w:right w:val="nil" w:sz="4" w:space="0" w:color="000000"/>
-              <w:insideH w:val="nil" w:sz="4" w:space="0" w:color="000000"/>
-              <w:insideV w:val="nil" w:sz="4" w:space="0" w:color="000000"/>
-            </w:tcBorders>
           </w:tcPr>
           <w:p>
-            <w:pPr>
-              <w:jc w:val="left"/>
-            </w:pPr>
             <w:r>
               <w:rPr>
                 <w:rFonts w:ascii="Times New Roman" w:hAnsi="Times New Roman" w:eastAsia="Times New Roman"/>
@@ -5361,19 +4107,8 @@
         <w:tc>
           <w:tcPr>
             <w:tcW w:type="dxa" w:w="2340"/>
-            <w:tcBorders>
-              <w:top w:val="nil" w:sz="4" w:space="0" w:color="000000"/>
-              <w:left w:val="nil" w:sz="4" w:space="0" w:color="000000"/>
-              <w:bottom w:val="single" w:sz="4" w:space="0" w:color="000000"/>
-              <w:right w:val="nil" w:sz="4" w:space="0" w:color="000000"/>
-              <w:insideH w:val="nil" w:sz="4" w:space="0" w:color="000000"/>
-              <w:insideV w:val="nil" w:sz="4" w:space="0" w:color="000000"/>
-            </w:tcBorders>
           </w:tcPr>
           <w:p>
-            <w:pPr>
-              <w:jc w:val="left"/>
-            </w:pPr>
             <w:r>
               <w:rPr>
                 <w:rFonts w:ascii="Times New Roman" w:hAnsi="Times New Roman" w:eastAsia="Times New Roman"/>
@@ -5387,19 +4122,8 @@
         <w:tc>
           <w:tcPr>
             <w:tcW w:type="dxa" w:w="2340"/>
-            <w:tcBorders>
-              <w:top w:val="nil" w:sz="4" w:space="0" w:color="000000"/>
-              <w:left w:val="nil" w:sz="4" w:space="0" w:color="000000"/>
-              <w:bottom w:val="single" w:sz="4" w:space="0" w:color="000000"/>
-              <w:right w:val="nil" w:sz="4" w:space="0" w:color="000000"/>
-              <w:insideH w:val="nil" w:sz="4" w:space="0" w:color="000000"/>
-              <w:insideV w:val="nil" w:sz="4" w:space="0" w:color="000000"/>
-            </w:tcBorders>
           </w:tcPr>
           <w:p>
-            <w:pPr>
-              <w:jc w:val="left"/>
-            </w:pPr>
             <w:r>
               <w:rPr>
                 <w:rFonts w:ascii="Times New Roman" w:hAnsi="Times New Roman" w:eastAsia="Times New Roman"/>
@@ -5413,19 +4137,8 @@
         <w:tc>
           <w:tcPr>
             <w:tcW w:type="dxa" w:w="2340"/>
-            <w:tcBorders>
-              <w:top w:val="nil" w:sz="4" w:space="0" w:color="000000"/>
-              <w:left w:val="nil" w:sz="4" w:space="0" w:color="000000"/>
-              <w:bottom w:val="single" w:sz="4" w:space="0" w:color="000000"/>
-              <w:right w:val="nil" w:sz="4" w:space="0" w:color="000000"/>
-              <w:insideH w:val="nil" w:sz="4" w:space="0" w:color="000000"/>
-              <w:insideV w:val="nil" w:sz="4" w:space="0" w:color="000000"/>
-            </w:tcBorders>
           </w:tcPr>
           <w:p>
-            <w:pPr>
-              <w:jc w:val="right"/>
-            </w:pPr>
             <w:r>
               <w:rPr>
                 <w:rFonts w:ascii="Times New Roman" w:hAnsi="Times New Roman" w:eastAsia="Times New Roman"/>
@@ -5439,19 +4152,8 @@
         <w:tc>
           <w:tcPr>
             <w:tcW w:type="dxa" w:w="2340"/>
-            <w:tcBorders>
-              <w:top w:val="nil" w:sz="4" w:space="0" w:color="000000"/>
-              <w:left w:val="nil" w:sz="4" w:space="0" w:color="000000"/>
-              <w:bottom w:val="single" w:sz="4" w:space="0" w:color="000000"/>
-              <w:right w:val="nil" w:sz="4" w:space="0" w:color="000000"/>
-              <w:insideH w:val="nil" w:sz="4" w:space="0" w:color="000000"/>
-              <w:insideV w:val="nil" w:sz="4" w:space="0" w:color="000000"/>
-            </w:tcBorders>
           </w:tcPr>
           <w:p>
-            <w:pPr>
-              <w:jc w:val="left"/>
-            </w:pPr>
             <w:r>
               <w:rPr>
                 <w:rFonts w:ascii="Times New Roman" w:hAnsi="Times New Roman" w:eastAsia="Times New Roman"/>
@@ -5711,19 +4413,8 @@
         <w:tc>
           <w:tcPr>
             <w:tcW w:type="dxa" w:w="1872"/>
-            <w:tcBorders>
-              <w:top w:val="single" w:sz="4" w:space="0" w:color="000000"/>
-              <w:left w:val="nil" w:sz="4" w:space="0" w:color="000000"/>
-              <w:bottom w:val="single" w:sz="4" w:space="0" w:color="000000"/>
-              <w:right w:val="nil" w:sz="4" w:space="0" w:color="000000"/>
-              <w:insideH w:val="nil" w:sz="4" w:space="0" w:color="000000"/>
-              <w:insideV w:val="nil" w:sz="4" w:space="0" w:color="000000"/>
-            </w:tcBorders>
           </w:tcPr>
           <w:p>
-            <w:pPr>
-              <w:jc w:val="center"/>
-            </w:pPr>
             <w:r>
               <w:rPr>
                 <w:rFonts w:ascii="Times New Roman" w:hAnsi="Times New Roman" w:eastAsia="Times New Roman"/>
@@ -5737,19 +4428,8 @@
         <w:tc>
           <w:tcPr>
             <w:tcW w:type="dxa" w:w="1872"/>
-            <w:tcBorders>
-              <w:top w:val="single" w:sz="4" w:space="0" w:color="000000"/>
-              <w:left w:val="nil" w:sz="4" w:space="0" w:color="000000"/>
-              <w:bottom w:val="single" w:sz="4" w:space="0" w:color="000000"/>
-              <w:right w:val="nil" w:sz="4" w:space="0" w:color="000000"/>
-              <w:insideH w:val="nil" w:sz="4" w:space="0" w:color="000000"/>
-              <w:insideV w:val="nil" w:sz="4" w:space="0" w:color="000000"/>
-            </w:tcBorders>
           </w:tcPr>
           <w:p>
-            <w:pPr>
-              <w:jc w:val="center"/>
-            </w:pPr>
             <w:r>
               <w:rPr>
                 <w:rFonts w:ascii="Times New Roman" w:hAnsi="Times New Roman" w:eastAsia="Times New Roman"/>
@@ -5763,19 +4443,8 @@
         <w:tc>
           <w:tcPr>
             <w:tcW w:type="dxa" w:w="1872"/>
-            <w:tcBorders>
-              <w:top w:val="single" w:sz="4" w:space="0" w:color="000000"/>
-              <w:left w:val="nil" w:sz="4" w:space="0" w:color="000000"/>
-              <w:bottom w:val="single" w:sz="4" w:space="0" w:color="000000"/>
-              <w:right w:val="nil" w:sz="4" w:space="0" w:color="000000"/>
-              <w:insideH w:val="nil" w:sz="4" w:space="0" w:color="000000"/>
-              <w:insideV w:val="nil" w:sz="4" w:space="0" w:color="000000"/>
-            </w:tcBorders>
           </w:tcPr>
           <w:p>
-            <w:pPr>
-              <w:jc w:val="center"/>
-            </w:pPr>
             <w:r>
               <w:rPr>
                 <w:rFonts w:ascii="Times New Roman" w:hAnsi="Times New Roman" w:eastAsia="Times New Roman"/>
@@ -5789,19 +4458,8 @@
         <w:tc>
           <w:tcPr>
             <w:tcW w:type="dxa" w:w="1872"/>
-            <w:tcBorders>
-              <w:top w:val="single" w:sz="4" w:space="0" w:color="000000"/>
-              <w:left w:val="nil" w:sz="4" w:space="0" w:color="000000"/>
-              <w:bottom w:val="single" w:sz="4" w:space="0" w:color="000000"/>
-              <w:right w:val="nil" w:sz="4" w:space="0" w:color="000000"/>
-              <w:insideH w:val="nil" w:sz="4" w:space="0" w:color="000000"/>
-              <w:insideV w:val="nil" w:sz="4" w:space="0" w:color="000000"/>
-            </w:tcBorders>
           </w:tcPr>
           <w:p>
-            <w:pPr>
-              <w:jc w:val="center"/>
-            </w:pPr>
             <w:r>
               <w:rPr>
                 <w:rFonts w:ascii="Times New Roman" w:hAnsi="Times New Roman" w:eastAsia="Times New Roman"/>
@@ -5815,19 +4473,8 @@
         <w:tc>
           <w:tcPr>
             <w:tcW w:type="dxa" w:w="1872"/>
-            <w:tcBorders>
-              <w:top w:val="single" w:sz="4" w:space="0" w:color="000000"/>
-              <w:left w:val="nil" w:sz="4" w:space="0" w:color="000000"/>
-              <w:bottom w:val="single" w:sz="4" w:space="0" w:color="000000"/>
-              <w:right w:val="nil" w:sz="4" w:space="0" w:color="000000"/>
-              <w:insideH w:val="nil" w:sz="4" w:space="0" w:color="000000"/>
-              <w:insideV w:val="nil" w:sz="4" w:space="0" w:color="000000"/>
-            </w:tcBorders>
           </w:tcPr>
           <w:p>
-            <w:pPr>
-              <w:jc w:val="center"/>
-            </w:pPr>
             <w:r>
               <w:rPr>
                 <w:rFonts w:ascii="Times New Roman" w:hAnsi="Times New Roman" w:eastAsia="Times New Roman"/>
@@ -5843,19 +4490,8 @@
         <w:tc>
           <w:tcPr>
             <w:tcW w:type="dxa" w:w="1872"/>
-            <w:tcBorders>
-              <w:top w:val="nil" w:sz="4" w:space="0" w:color="000000"/>
-              <w:left w:val="nil" w:sz="4" w:space="0" w:color="000000"/>
-              <w:bottom w:val="nil" w:sz="4" w:space="0" w:color="000000"/>
-              <w:right w:val="nil" w:sz="4" w:space="0" w:color="000000"/>
-              <w:insideH w:val="nil" w:sz="4" w:space="0" w:color="000000"/>
-              <w:insideV w:val="nil" w:sz="4" w:space="0" w:color="000000"/>
-            </w:tcBorders>
           </w:tcPr>
           <w:p>
-            <w:pPr>
-              <w:jc w:val="left"/>
-            </w:pPr>
             <w:r>
               <w:rPr>
                 <w:rFonts w:ascii="Times New Roman" w:hAnsi="Times New Roman" w:eastAsia="Times New Roman"/>
@@ -5869,19 +4505,8 @@
         <w:tc>
           <w:tcPr>
             <w:tcW w:type="dxa" w:w="1872"/>
-            <w:tcBorders>
-              <w:top w:val="nil" w:sz="4" w:space="0" w:color="000000"/>
-              <w:left w:val="nil" w:sz="4" w:space="0" w:color="000000"/>
-              <w:bottom w:val="nil" w:sz="4" w:space="0" w:color="000000"/>
-              <w:right w:val="nil" w:sz="4" w:space="0" w:color="000000"/>
-              <w:insideH w:val="nil" w:sz="4" w:space="0" w:color="000000"/>
-              <w:insideV w:val="nil" w:sz="4" w:space="0" w:color="000000"/>
-            </w:tcBorders>
           </w:tcPr>
           <w:p>
-            <w:pPr>
-              <w:jc w:val="left"/>
-            </w:pPr>
             <w:r>
               <w:rPr>
                 <w:rFonts w:ascii="Times New Roman" w:hAnsi="Times New Roman" w:eastAsia="Times New Roman"/>
@@ -5895,19 +4520,8 @@
         <w:tc>
           <w:tcPr>
             <w:tcW w:type="dxa" w:w="1872"/>
-            <w:tcBorders>
-              <w:top w:val="nil" w:sz="4" w:space="0" w:color="000000"/>
-              <w:left w:val="nil" w:sz="4" w:space="0" w:color="000000"/>
-              <w:bottom w:val="nil" w:sz="4" w:space="0" w:color="000000"/>
-              <w:right w:val="nil" w:sz="4" w:space="0" w:color="000000"/>
-              <w:insideH w:val="nil" w:sz="4" w:space="0" w:color="000000"/>
-              <w:insideV w:val="nil" w:sz="4" w:space="0" w:color="000000"/>
-            </w:tcBorders>
           </w:tcPr>
           <w:p>
-            <w:pPr>
-              <w:jc w:val="right"/>
-            </w:pPr>
             <w:r>
               <w:rPr>
                 <w:rFonts w:ascii="Times New Roman" w:hAnsi="Times New Roman" w:eastAsia="Times New Roman"/>
@@ -5921,19 +4535,8 @@
         <w:tc>
           <w:tcPr>
             <w:tcW w:type="dxa" w:w="1872"/>
-            <w:tcBorders>
-              <w:top w:val="nil" w:sz="4" w:space="0" w:color="000000"/>
-              <w:left w:val="nil" w:sz="4" w:space="0" w:color="000000"/>
-              <w:bottom w:val="nil" w:sz="4" w:space="0" w:color="000000"/>
-              <w:right w:val="nil" w:sz="4" w:space="0" w:color="000000"/>
-              <w:insideH w:val="nil" w:sz="4" w:space="0" w:color="000000"/>
-              <w:insideV w:val="nil" w:sz="4" w:space="0" w:color="000000"/>
-            </w:tcBorders>
           </w:tcPr>
           <w:p>
-            <w:pPr>
-              <w:jc w:val="left"/>
-            </w:pPr>
             <w:r>
               <w:rPr>
                 <w:rFonts w:ascii="Times New Roman" w:hAnsi="Times New Roman" w:eastAsia="Times New Roman"/>
@@ -5947,19 +4550,8 @@
         <w:tc>
           <w:tcPr>
             <w:tcW w:type="dxa" w:w="1872"/>
-            <w:tcBorders>
-              <w:top w:val="nil" w:sz="4" w:space="0" w:color="000000"/>
-              <w:left w:val="nil" w:sz="4" w:space="0" w:color="000000"/>
-              <w:bottom w:val="nil" w:sz="4" w:space="0" w:color="000000"/>
-              <w:right w:val="nil" w:sz="4" w:space="0" w:color="000000"/>
-              <w:insideH w:val="nil" w:sz="4" w:space="0" w:color="000000"/>
-              <w:insideV w:val="nil" w:sz="4" w:space="0" w:color="000000"/>
-            </w:tcBorders>
           </w:tcPr>
           <w:p>
-            <w:pPr>
-              <w:jc w:val="left"/>
-            </w:pPr>
             <w:r>
               <w:rPr>
                 <w:rFonts w:ascii="Times New Roman" w:hAnsi="Times New Roman" w:eastAsia="Times New Roman"/>
@@ -5975,19 +4567,8 @@
         <w:tc>
           <w:tcPr>
             <w:tcW w:type="dxa" w:w="1872"/>
-            <w:tcBorders>
-              <w:top w:val="nil" w:sz="4" w:space="0" w:color="000000"/>
-              <w:left w:val="nil" w:sz="4" w:space="0" w:color="000000"/>
-              <w:bottom w:val="nil" w:sz="4" w:space="0" w:color="000000"/>
-              <w:right w:val="nil" w:sz="4" w:space="0" w:color="000000"/>
-              <w:insideH w:val="nil" w:sz="4" w:space="0" w:color="000000"/>
-              <w:insideV w:val="nil" w:sz="4" w:space="0" w:color="000000"/>
-            </w:tcBorders>
           </w:tcPr>
           <w:p>
-            <w:pPr>
-              <w:jc w:val="left"/>
-            </w:pPr>
             <w:r>
               <w:rPr>
                 <w:rFonts w:ascii="Times New Roman" w:hAnsi="Times New Roman" w:eastAsia="Times New Roman"/>
@@ -6001,19 +4582,8 @@
         <w:tc>
           <w:tcPr>
             <w:tcW w:type="dxa" w:w="1872"/>
-            <w:tcBorders>
-              <w:top w:val="nil" w:sz="4" w:space="0" w:color="000000"/>
-              <w:left w:val="nil" w:sz="4" w:space="0" w:color="000000"/>
-              <w:bottom w:val="nil" w:sz="4" w:space="0" w:color="000000"/>
-              <w:right w:val="nil" w:sz="4" w:space="0" w:color="000000"/>
-              <w:insideH w:val="nil" w:sz="4" w:space="0" w:color="000000"/>
-              <w:insideV w:val="nil" w:sz="4" w:space="0" w:color="000000"/>
-            </w:tcBorders>
           </w:tcPr>
           <w:p>
-            <w:pPr>
-              <w:jc w:val="left"/>
-            </w:pPr>
             <w:r>
               <w:rPr>
                 <w:rFonts w:ascii="Times New Roman" w:hAnsi="Times New Roman" w:eastAsia="Times New Roman"/>
@@ -6027,19 +4597,8 @@
         <w:tc>
           <w:tcPr>
             <w:tcW w:type="dxa" w:w="1872"/>
-            <w:tcBorders>
-              <w:top w:val="nil" w:sz="4" w:space="0" w:color="000000"/>
-              <w:left w:val="nil" w:sz="4" w:space="0" w:color="000000"/>
-              <w:bottom w:val="nil" w:sz="4" w:space="0" w:color="000000"/>
-              <w:right w:val="nil" w:sz="4" w:space="0" w:color="000000"/>
-              <w:insideH w:val="nil" w:sz="4" w:space="0" w:color="000000"/>
-              <w:insideV w:val="nil" w:sz="4" w:space="0" w:color="000000"/>
-            </w:tcBorders>
           </w:tcPr>
           <w:p>
-            <w:pPr>
-              <w:jc w:val="right"/>
-            </w:pPr>
             <w:r>
               <w:rPr>
                 <w:rFonts w:ascii="Times New Roman" w:hAnsi="Times New Roman" w:eastAsia="Times New Roman"/>
@@ -6053,19 +4612,8 @@
         <w:tc>
           <w:tcPr>
             <w:tcW w:type="dxa" w:w="1872"/>
-            <w:tcBorders>
-              <w:top w:val="nil" w:sz="4" w:space="0" w:color="000000"/>
-              <w:left w:val="nil" w:sz="4" w:space="0" w:color="000000"/>
-              <w:bottom w:val="nil" w:sz="4" w:space="0" w:color="000000"/>
-              <w:right w:val="nil" w:sz="4" w:space="0" w:color="000000"/>
-              <w:insideH w:val="nil" w:sz="4" w:space="0" w:color="000000"/>
-              <w:insideV w:val="nil" w:sz="4" w:space="0" w:color="000000"/>
-            </w:tcBorders>
           </w:tcPr>
           <w:p>
-            <w:pPr>
-              <w:jc w:val="left"/>
-            </w:pPr>
             <w:r>
               <w:rPr>
                 <w:rFonts w:ascii="Times New Roman" w:hAnsi="Times New Roman" w:eastAsia="Times New Roman"/>
@@ -6079,19 +4627,8 @@
         <w:tc>
           <w:tcPr>
             <w:tcW w:type="dxa" w:w="1872"/>
-            <w:tcBorders>
-              <w:top w:val="nil" w:sz="4" w:space="0" w:color="000000"/>
-              <w:left w:val="nil" w:sz="4" w:space="0" w:color="000000"/>
-              <w:bottom w:val="nil" w:sz="4" w:space="0" w:color="000000"/>
-              <w:right w:val="nil" w:sz="4" w:space="0" w:color="000000"/>
-              <w:insideH w:val="nil" w:sz="4" w:space="0" w:color="000000"/>
-              <w:insideV w:val="nil" w:sz="4" w:space="0" w:color="000000"/>
-            </w:tcBorders>
           </w:tcPr>
           <w:p>
-            <w:pPr>
-              <w:jc w:val="left"/>
-            </w:pPr>
             <w:r>
               <w:rPr>
                 <w:rFonts w:ascii="Times New Roman" w:hAnsi="Times New Roman" w:eastAsia="Times New Roman"/>
@@ -6107,19 +4644,8 @@
         <w:tc>
           <w:tcPr>
             <w:tcW w:type="dxa" w:w="1872"/>
-            <w:tcBorders>
-              <w:top w:val="nil" w:sz="4" w:space="0" w:color="000000"/>
-              <w:left w:val="nil" w:sz="4" w:space="0" w:color="000000"/>
-              <w:bottom w:val="single" w:sz="4" w:space="0" w:color="000000"/>
-              <w:right w:val="nil" w:sz="4" w:space="0" w:color="000000"/>
-              <w:insideH w:val="nil" w:sz="4" w:space="0" w:color="000000"/>
-              <w:insideV w:val="nil" w:sz="4" w:space="0" w:color="000000"/>
-            </w:tcBorders>
           </w:tcPr>
           <w:p>
-            <w:pPr>
-              <w:jc w:val="left"/>
-            </w:pPr>
             <w:r>
               <w:rPr>
                 <w:rFonts w:ascii="Times New Roman" w:hAnsi="Times New Roman" w:eastAsia="Times New Roman"/>
@@ -6133,19 +4659,8 @@
         <w:tc>
           <w:tcPr>
             <w:tcW w:type="dxa" w:w="1872"/>
-            <w:tcBorders>
-              <w:top w:val="nil" w:sz="4" w:space="0" w:color="000000"/>
-              <w:left w:val="nil" w:sz="4" w:space="0" w:color="000000"/>
-              <w:bottom w:val="single" w:sz="4" w:space="0" w:color="000000"/>
-              <w:right w:val="nil" w:sz="4" w:space="0" w:color="000000"/>
-              <w:insideH w:val="nil" w:sz="4" w:space="0" w:color="000000"/>
-              <w:insideV w:val="nil" w:sz="4" w:space="0" w:color="000000"/>
-            </w:tcBorders>
           </w:tcPr>
           <w:p>
-            <w:pPr>
-              <w:jc w:val="left"/>
-            </w:pPr>
             <w:r>
               <w:rPr>
                 <w:rFonts w:ascii="Times New Roman" w:hAnsi="Times New Roman" w:eastAsia="Times New Roman"/>
@@ -6159,19 +4674,8 @@
         <w:tc>
           <w:tcPr>
             <w:tcW w:type="dxa" w:w="1872"/>
-            <w:tcBorders>
-              <w:top w:val="nil" w:sz="4" w:space="0" w:color="000000"/>
-              <w:left w:val="nil" w:sz="4" w:space="0" w:color="000000"/>
-              <w:bottom w:val="single" w:sz="4" w:space="0" w:color="000000"/>
-              <w:right w:val="nil" w:sz="4" w:space="0" w:color="000000"/>
-              <w:insideH w:val="nil" w:sz="4" w:space="0" w:color="000000"/>
-              <w:insideV w:val="nil" w:sz="4" w:space="0" w:color="000000"/>
-            </w:tcBorders>
           </w:tcPr>
           <w:p>
-            <w:pPr>
-              <w:jc w:val="right"/>
-            </w:pPr>
             <w:r>
               <w:rPr>
                 <w:rFonts w:ascii="Times New Roman" w:hAnsi="Times New Roman" w:eastAsia="Times New Roman"/>
@@ -6185,19 +4689,8 @@
         <w:tc>
           <w:tcPr>
             <w:tcW w:type="dxa" w:w="1872"/>
-            <w:tcBorders>
-              <w:top w:val="nil" w:sz="4" w:space="0" w:color="000000"/>
-              <w:left w:val="nil" w:sz="4" w:space="0" w:color="000000"/>
-              <w:bottom w:val="single" w:sz="4" w:space="0" w:color="000000"/>
-              <w:right w:val="nil" w:sz="4" w:space="0" w:color="000000"/>
-              <w:insideH w:val="nil" w:sz="4" w:space="0" w:color="000000"/>
-              <w:insideV w:val="nil" w:sz="4" w:space="0" w:color="000000"/>
-            </w:tcBorders>
           </w:tcPr>
           <w:p>
-            <w:pPr>
-              <w:jc w:val="left"/>
-            </w:pPr>
             <w:r>
               <w:rPr>
                 <w:rFonts w:ascii="Times New Roman" w:hAnsi="Times New Roman" w:eastAsia="Times New Roman"/>
@@ -6211,19 +4704,8 @@
         <w:tc>
           <w:tcPr>
             <w:tcW w:type="dxa" w:w="1872"/>
-            <w:tcBorders>
-              <w:top w:val="nil" w:sz="4" w:space="0" w:color="000000"/>
-              <w:left w:val="nil" w:sz="4" w:space="0" w:color="000000"/>
-              <w:bottom w:val="single" w:sz="4" w:space="0" w:color="000000"/>
-              <w:right w:val="nil" w:sz="4" w:space="0" w:color="000000"/>
-              <w:insideH w:val="nil" w:sz="4" w:space="0" w:color="000000"/>
-              <w:insideV w:val="nil" w:sz="4" w:space="0" w:color="000000"/>
-            </w:tcBorders>
           </w:tcPr>
           <w:p>
-            <w:pPr>
-              <w:jc w:val="left"/>
-            </w:pPr>
             <w:r>
               <w:rPr>
                 <w:rFonts w:ascii="Times New Roman" w:hAnsi="Times New Roman" w:eastAsia="Times New Roman"/>
@@ -6397,19 +4879,8 @@
         <w:tc>
           <w:tcPr>
             <w:tcW w:type="dxa" w:w="1872"/>
-            <w:tcBorders>
-              <w:top w:val="single" w:sz="4" w:space="0" w:color="000000"/>
-              <w:left w:val="nil" w:sz="4" w:space="0" w:color="000000"/>
-              <w:bottom w:val="single" w:sz="4" w:space="0" w:color="000000"/>
-              <w:right w:val="nil" w:sz="4" w:space="0" w:color="000000"/>
-              <w:insideH w:val="nil" w:sz="4" w:space="0" w:color="000000"/>
-              <w:insideV w:val="nil" w:sz="4" w:space="0" w:color="000000"/>
-            </w:tcBorders>
           </w:tcPr>
           <w:p>
-            <w:pPr>
-              <w:jc w:val="center"/>
-            </w:pPr>
             <w:r>
               <w:rPr>
                 <w:rFonts w:ascii="Times New Roman" w:hAnsi="Times New Roman" w:eastAsia="Times New Roman"/>
@@ -6423,19 +4894,8 @@
         <w:tc>
           <w:tcPr>
             <w:tcW w:type="dxa" w:w="1872"/>
-            <w:tcBorders>
-              <w:top w:val="single" w:sz="4" w:space="0" w:color="000000"/>
-              <w:left w:val="nil" w:sz="4" w:space="0" w:color="000000"/>
-              <w:bottom w:val="single" w:sz="4" w:space="0" w:color="000000"/>
-              <w:right w:val="nil" w:sz="4" w:space="0" w:color="000000"/>
-              <w:insideH w:val="nil" w:sz="4" w:space="0" w:color="000000"/>
-              <w:insideV w:val="nil" w:sz="4" w:space="0" w:color="000000"/>
-            </w:tcBorders>
           </w:tcPr>
           <w:p>
-            <w:pPr>
-              <w:jc w:val="center"/>
-            </w:pPr>
             <w:r>
               <w:rPr>
                 <w:rFonts w:ascii="Times New Roman" w:hAnsi="Times New Roman" w:eastAsia="Times New Roman"/>
@@ -6449,19 +4909,8 @@
         <w:tc>
           <w:tcPr>
             <w:tcW w:type="dxa" w:w="1872"/>
-            <w:tcBorders>
-              <w:top w:val="single" w:sz="4" w:space="0" w:color="000000"/>
-              <w:left w:val="nil" w:sz="4" w:space="0" w:color="000000"/>
-              <w:bottom w:val="single" w:sz="4" w:space="0" w:color="000000"/>
-              <w:right w:val="nil" w:sz="4" w:space="0" w:color="000000"/>
-              <w:insideH w:val="nil" w:sz="4" w:space="0" w:color="000000"/>
-              <w:insideV w:val="nil" w:sz="4" w:space="0" w:color="000000"/>
-            </w:tcBorders>
           </w:tcPr>
           <w:p>
-            <w:pPr>
-              <w:jc w:val="center"/>
-            </w:pPr>
             <w:r>
               <w:rPr>
                 <w:rFonts w:ascii="Times New Roman" w:hAnsi="Times New Roman" w:eastAsia="Times New Roman"/>
@@ -6475,19 +4924,8 @@
         <w:tc>
           <w:tcPr>
             <w:tcW w:type="dxa" w:w="1872"/>
-            <w:tcBorders>
-              <w:top w:val="single" w:sz="4" w:space="0" w:color="000000"/>
-              <w:left w:val="nil" w:sz="4" w:space="0" w:color="000000"/>
-              <w:bottom w:val="single" w:sz="4" w:space="0" w:color="000000"/>
-              <w:right w:val="nil" w:sz="4" w:space="0" w:color="000000"/>
-              <w:insideH w:val="nil" w:sz="4" w:space="0" w:color="000000"/>
-              <w:insideV w:val="nil" w:sz="4" w:space="0" w:color="000000"/>
-            </w:tcBorders>
           </w:tcPr>
           <w:p>
-            <w:pPr>
-              <w:jc w:val="center"/>
-            </w:pPr>
             <w:r>
               <w:rPr>
                 <w:rFonts w:ascii="Times New Roman" w:hAnsi="Times New Roman" w:eastAsia="Times New Roman"/>
@@ -6501,19 +4939,8 @@
         <w:tc>
           <w:tcPr>
             <w:tcW w:type="dxa" w:w="1872"/>
-            <w:tcBorders>
-              <w:top w:val="single" w:sz="4" w:space="0" w:color="000000"/>
-              <w:left w:val="nil" w:sz="4" w:space="0" w:color="000000"/>
-              <w:bottom w:val="single" w:sz="4" w:space="0" w:color="000000"/>
-              <w:right w:val="nil" w:sz="4" w:space="0" w:color="000000"/>
-              <w:insideH w:val="nil" w:sz="4" w:space="0" w:color="000000"/>
-              <w:insideV w:val="nil" w:sz="4" w:space="0" w:color="000000"/>
-            </w:tcBorders>
           </w:tcPr>
           <w:p>
-            <w:pPr>
-              <w:jc w:val="center"/>
-            </w:pPr>
             <w:r>
               <w:rPr>
                 <w:rFonts w:ascii="Times New Roman" w:hAnsi="Times New Roman" w:eastAsia="Times New Roman"/>
@@ -6529,19 +4956,8 @@
         <w:tc>
           <w:tcPr>
             <w:tcW w:type="dxa" w:w="1872"/>
-            <w:tcBorders>
-              <w:top w:val="nil" w:sz="4" w:space="0" w:color="000000"/>
-              <w:left w:val="nil" w:sz="4" w:space="0" w:color="000000"/>
-              <w:bottom w:val="nil" w:sz="4" w:space="0" w:color="000000"/>
-              <w:right w:val="nil" w:sz="4" w:space="0" w:color="000000"/>
-              <w:insideH w:val="nil" w:sz="4" w:space="0" w:color="000000"/>
-              <w:insideV w:val="nil" w:sz="4" w:space="0" w:color="000000"/>
-            </w:tcBorders>
           </w:tcPr>
           <w:p>
-            <w:pPr>
-              <w:jc w:val="left"/>
-            </w:pPr>
             <w:r>
               <w:rPr>
                 <w:rFonts w:ascii="Times New Roman" w:hAnsi="Times New Roman" w:eastAsia="Times New Roman"/>
@@ -6555,19 +4971,8 @@
         <w:tc>
           <w:tcPr>
             <w:tcW w:type="dxa" w:w="1872"/>
-            <w:tcBorders>
-              <w:top w:val="nil" w:sz="4" w:space="0" w:color="000000"/>
-              <w:left w:val="nil" w:sz="4" w:space="0" w:color="000000"/>
-              <w:bottom w:val="nil" w:sz="4" w:space="0" w:color="000000"/>
-              <w:right w:val="nil" w:sz="4" w:space="0" w:color="000000"/>
-              <w:insideH w:val="nil" w:sz="4" w:space="0" w:color="000000"/>
-              <w:insideV w:val="nil" w:sz="4" w:space="0" w:color="000000"/>
-            </w:tcBorders>
           </w:tcPr>
           <w:p>
-            <w:pPr>
-              <w:jc w:val="left"/>
-            </w:pPr>
             <w:r>
               <w:rPr>
                 <w:rFonts w:ascii="Times New Roman" w:hAnsi="Times New Roman" w:eastAsia="Times New Roman"/>
@@ -6581,19 +4986,8 @@
         <w:tc>
           <w:tcPr>
             <w:tcW w:type="dxa" w:w="1872"/>
-            <w:tcBorders>
-              <w:top w:val="nil" w:sz="4" w:space="0" w:color="000000"/>
-              <w:left w:val="nil" w:sz="4" w:space="0" w:color="000000"/>
-              <w:bottom w:val="nil" w:sz="4" w:space="0" w:color="000000"/>
-              <w:right w:val="nil" w:sz="4" w:space="0" w:color="000000"/>
-              <w:insideH w:val="nil" w:sz="4" w:space="0" w:color="000000"/>
-              <w:insideV w:val="nil" w:sz="4" w:space="0" w:color="000000"/>
-            </w:tcBorders>
           </w:tcPr>
           <w:p>
-            <w:pPr>
-              <w:jc w:val="right"/>
-            </w:pPr>
             <w:r>
               <w:rPr>
                 <w:rFonts w:ascii="Times New Roman" w:hAnsi="Times New Roman" w:eastAsia="Times New Roman"/>
@@ -6607,19 +5001,8 @@
         <w:tc>
           <w:tcPr>
             <w:tcW w:type="dxa" w:w="1872"/>
-            <w:tcBorders>
-              <w:top w:val="nil" w:sz="4" w:space="0" w:color="000000"/>
-              <w:left w:val="nil" w:sz="4" w:space="0" w:color="000000"/>
-              <w:bottom w:val="nil" w:sz="4" w:space="0" w:color="000000"/>
-              <w:right w:val="nil" w:sz="4" w:space="0" w:color="000000"/>
-              <w:insideH w:val="nil" w:sz="4" w:space="0" w:color="000000"/>
-              <w:insideV w:val="nil" w:sz="4" w:space="0" w:color="000000"/>
-            </w:tcBorders>
           </w:tcPr>
           <w:p>
-            <w:pPr>
-              <w:jc w:val="right"/>
-            </w:pPr>
             <w:r>
               <w:rPr>
                 <w:rFonts w:ascii="Times New Roman" w:hAnsi="Times New Roman" w:eastAsia="Times New Roman"/>
@@ -6633,19 +5016,8 @@
         <w:tc>
           <w:tcPr>
             <w:tcW w:type="dxa" w:w="1872"/>
-            <w:tcBorders>
-              <w:top w:val="nil" w:sz="4" w:space="0" w:color="000000"/>
-              <w:left w:val="nil" w:sz="4" w:space="0" w:color="000000"/>
-              <w:bottom w:val="nil" w:sz="4" w:space="0" w:color="000000"/>
-              <w:right w:val="nil" w:sz="4" w:space="0" w:color="000000"/>
-              <w:insideH w:val="nil" w:sz="4" w:space="0" w:color="000000"/>
-              <w:insideV w:val="nil" w:sz="4" w:space="0" w:color="000000"/>
-            </w:tcBorders>
           </w:tcPr>
           <w:p>
-            <w:pPr>
-              <w:jc w:val="left"/>
-            </w:pPr>
             <w:r>
               <w:rPr>
                 <w:rFonts w:ascii="Times New Roman" w:hAnsi="Times New Roman" w:eastAsia="Times New Roman"/>
@@ -6661,19 +5033,8 @@
         <w:tc>
           <w:tcPr>
             <w:tcW w:type="dxa" w:w="1872"/>
-            <w:tcBorders>
-              <w:top w:val="nil" w:sz="4" w:space="0" w:color="000000"/>
-              <w:left w:val="nil" w:sz="4" w:space="0" w:color="000000"/>
-              <w:bottom w:val="nil" w:sz="4" w:space="0" w:color="000000"/>
-              <w:right w:val="nil" w:sz="4" w:space="0" w:color="000000"/>
-              <w:insideH w:val="nil" w:sz="4" w:space="0" w:color="000000"/>
-              <w:insideV w:val="nil" w:sz="4" w:space="0" w:color="000000"/>
-            </w:tcBorders>
           </w:tcPr>
           <w:p>
-            <w:pPr>
-              <w:jc w:val="left"/>
-            </w:pPr>
             <w:r>
               <w:rPr>
                 <w:rFonts w:ascii="Times New Roman" w:hAnsi="Times New Roman" w:eastAsia="Times New Roman"/>
@@ -6687,19 +5048,8 @@
         <w:tc>
           <w:tcPr>
             <w:tcW w:type="dxa" w:w="1872"/>
-            <w:tcBorders>
-              <w:top w:val="nil" w:sz="4" w:space="0" w:color="000000"/>
-              <w:left w:val="nil" w:sz="4" w:space="0" w:color="000000"/>
-              <w:bottom w:val="nil" w:sz="4" w:space="0" w:color="000000"/>
-              <w:right w:val="nil" w:sz="4" w:space="0" w:color="000000"/>
-              <w:insideH w:val="nil" w:sz="4" w:space="0" w:color="000000"/>
-              <w:insideV w:val="nil" w:sz="4" w:space="0" w:color="000000"/>
-            </w:tcBorders>
           </w:tcPr>
           <w:p>
-            <w:pPr>
-              <w:jc w:val="left"/>
-            </w:pPr>
             <w:r>
               <w:rPr>
                 <w:rFonts w:ascii="Times New Roman" w:hAnsi="Times New Roman" w:eastAsia="Times New Roman"/>
@@ -6713,19 +5063,8 @@
         <w:tc>
           <w:tcPr>
             <w:tcW w:type="dxa" w:w="1872"/>
-            <w:tcBorders>
-              <w:top w:val="nil" w:sz="4" w:space="0" w:color="000000"/>
-              <w:left w:val="nil" w:sz="4" w:space="0" w:color="000000"/>
-              <w:bottom w:val="nil" w:sz="4" w:space="0" w:color="000000"/>
-              <w:right w:val="nil" w:sz="4" w:space="0" w:color="000000"/>
-              <w:insideH w:val="nil" w:sz="4" w:space="0" w:color="000000"/>
-              <w:insideV w:val="nil" w:sz="4" w:space="0" w:color="000000"/>
-            </w:tcBorders>
           </w:tcPr>
           <w:p>
-            <w:pPr>
-              <w:jc w:val="right"/>
-            </w:pPr>
             <w:r>
               <w:rPr>
                 <w:rFonts w:ascii="Times New Roman" w:hAnsi="Times New Roman" w:eastAsia="Times New Roman"/>
@@ -6739,19 +5078,8 @@
         <w:tc>
           <w:tcPr>
             <w:tcW w:type="dxa" w:w="1872"/>
-            <w:tcBorders>
-              <w:top w:val="nil" w:sz="4" w:space="0" w:color="000000"/>
-              <w:left w:val="nil" w:sz="4" w:space="0" w:color="000000"/>
-              <w:bottom w:val="nil" w:sz="4" w:space="0" w:color="000000"/>
-              <w:right w:val="nil" w:sz="4" w:space="0" w:color="000000"/>
-              <w:insideH w:val="nil" w:sz="4" w:space="0" w:color="000000"/>
-              <w:insideV w:val="nil" w:sz="4" w:space="0" w:color="000000"/>
-            </w:tcBorders>
           </w:tcPr>
           <w:p>
-            <w:pPr>
-              <w:jc w:val="right"/>
-            </w:pPr>
             <w:r>
               <w:rPr>
                 <w:rFonts w:ascii="Times New Roman" w:hAnsi="Times New Roman" w:eastAsia="Times New Roman"/>
@@ -6765,19 +5093,8 @@
         <w:tc>
           <w:tcPr>
             <w:tcW w:type="dxa" w:w="1872"/>
-            <w:tcBorders>
-              <w:top w:val="nil" w:sz="4" w:space="0" w:color="000000"/>
-              <w:left w:val="nil" w:sz="4" w:space="0" w:color="000000"/>
-              <w:bottom w:val="nil" w:sz="4" w:space="0" w:color="000000"/>
-              <w:right w:val="nil" w:sz="4" w:space="0" w:color="000000"/>
-              <w:insideH w:val="nil" w:sz="4" w:space="0" w:color="000000"/>
-              <w:insideV w:val="nil" w:sz="4" w:space="0" w:color="000000"/>
-            </w:tcBorders>
           </w:tcPr>
           <w:p>
-            <w:pPr>
-              <w:jc w:val="left"/>
-            </w:pPr>
             <w:r>
               <w:rPr>
                 <w:rFonts w:ascii="Times New Roman" w:hAnsi="Times New Roman" w:eastAsia="Times New Roman"/>
@@ -6793,19 +5110,8 @@
         <w:tc>
           <w:tcPr>
             <w:tcW w:type="dxa" w:w="1872"/>
-            <w:tcBorders>
-              <w:top w:val="nil" w:sz="4" w:space="0" w:color="000000"/>
-              <w:left w:val="nil" w:sz="4" w:space="0" w:color="000000"/>
-              <w:bottom w:val="nil" w:sz="4" w:space="0" w:color="000000"/>
-              <w:right w:val="nil" w:sz="4" w:space="0" w:color="000000"/>
-              <w:insideH w:val="nil" w:sz="4" w:space="0" w:color="000000"/>
-              <w:insideV w:val="nil" w:sz="4" w:space="0" w:color="000000"/>
-            </w:tcBorders>
           </w:tcPr>
           <w:p>
-            <w:pPr>
-              <w:jc w:val="left"/>
-            </w:pPr>
             <w:r>
               <w:rPr>
                 <w:rFonts w:ascii="Times New Roman" w:hAnsi="Times New Roman" w:eastAsia="Times New Roman"/>
@@ -6819,19 +5125,8 @@
         <w:tc>
           <w:tcPr>
             <w:tcW w:type="dxa" w:w="1872"/>
-            <w:tcBorders>
-              <w:top w:val="nil" w:sz="4" w:space="0" w:color="000000"/>
-              <w:left w:val="nil" w:sz="4" w:space="0" w:color="000000"/>
-              <w:bottom w:val="nil" w:sz="4" w:space="0" w:color="000000"/>
-              <w:right w:val="nil" w:sz="4" w:space="0" w:color="000000"/>
-              <w:insideH w:val="nil" w:sz="4" w:space="0" w:color="000000"/>
-              <w:insideV w:val="nil" w:sz="4" w:space="0" w:color="000000"/>
-            </w:tcBorders>
           </w:tcPr>
           <w:p>
-            <w:pPr>
-              <w:jc w:val="left"/>
-            </w:pPr>
             <w:r>
               <w:rPr>
                 <w:rFonts w:ascii="Times New Roman" w:hAnsi="Times New Roman" w:eastAsia="Times New Roman"/>
@@ -6845,19 +5140,8 @@
         <w:tc>
           <w:tcPr>
             <w:tcW w:type="dxa" w:w="1872"/>
-            <w:tcBorders>
-              <w:top w:val="nil" w:sz="4" w:space="0" w:color="000000"/>
-              <w:left w:val="nil" w:sz="4" w:space="0" w:color="000000"/>
-              <w:bottom w:val="nil" w:sz="4" w:space="0" w:color="000000"/>
-              <w:right w:val="nil" w:sz="4" w:space="0" w:color="000000"/>
-              <w:insideH w:val="nil" w:sz="4" w:space="0" w:color="000000"/>
-              <w:insideV w:val="nil" w:sz="4" w:space="0" w:color="000000"/>
-            </w:tcBorders>
           </w:tcPr>
           <w:p>
-            <w:pPr>
-              <w:jc w:val="right"/>
-            </w:pPr>
             <w:r>
               <w:rPr>
                 <w:rFonts w:ascii="Times New Roman" w:hAnsi="Times New Roman" w:eastAsia="Times New Roman"/>
@@ -6871,19 +5155,8 @@
         <w:tc>
           <w:tcPr>
             <w:tcW w:type="dxa" w:w="1872"/>
-            <w:tcBorders>
-              <w:top w:val="nil" w:sz="4" w:space="0" w:color="000000"/>
-              <w:left w:val="nil" w:sz="4" w:space="0" w:color="000000"/>
-              <w:bottom w:val="nil" w:sz="4" w:space="0" w:color="000000"/>
-              <w:right w:val="nil" w:sz="4" w:space="0" w:color="000000"/>
-              <w:insideH w:val="nil" w:sz="4" w:space="0" w:color="000000"/>
-              <w:insideV w:val="nil" w:sz="4" w:space="0" w:color="000000"/>
-            </w:tcBorders>
           </w:tcPr>
           <w:p>
-            <w:pPr>
-              <w:jc w:val="right"/>
-            </w:pPr>
             <w:r>
               <w:rPr>
                 <w:rFonts w:ascii="Times New Roman" w:hAnsi="Times New Roman" w:eastAsia="Times New Roman"/>
@@ -6897,19 +5170,8 @@
         <w:tc>
           <w:tcPr>
             <w:tcW w:type="dxa" w:w="1872"/>
-            <w:tcBorders>
-              <w:top w:val="nil" w:sz="4" w:space="0" w:color="000000"/>
-              <w:left w:val="nil" w:sz="4" w:space="0" w:color="000000"/>
-              <w:bottom w:val="nil" w:sz="4" w:space="0" w:color="000000"/>
-              <w:right w:val="nil" w:sz="4" w:space="0" w:color="000000"/>
-              <w:insideH w:val="nil" w:sz="4" w:space="0" w:color="000000"/>
-              <w:insideV w:val="nil" w:sz="4" w:space="0" w:color="000000"/>
-            </w:tcBorders>
           </w:tcPr>
           <w:p>
-            <w:pPr>
-              <w:jc w:val="left"/>
-            </w:pPr>
             <w:r>
               <w:rPr>
                 <w:rFonts w:ascii="Times New Roman" w:hAnsi="Times New Roman" w:eastAsia="Times New Roman"/>
@@ -6925,19 +5187,8 @@
         <w:tc>
           <w:tcPr>
             <w:tcW w:type="dxa" w:w="1872"/>
-            <w:tcBorders>
-              <w:top w:val="nil" w:sz="4" w:space="0" w:color="000000"/>
-              <w:left w:val="nil" w:sz="4" w:space="0" w:color="000000"/>
-              <w:bottom w:val="single" w:sz="4" w:space="0" w:color="000000"/>
-              <w:right w:val="nil" w:sz="4" w:space="0" w:color="000000"/>
-              <w:insideH w:val="nil" w:sz="4" w:space="0" w:color="000000"/>
-              <w:insideV w:val="nil" w:sz="4" w:space="0" w:color="000000"/>
-            </w:tcBorders>
           </w:tcPr>
           <w:p>
-            <w:pPr>
-              <w:jc w:val="left"/>
-            </w:pPr>
             <w:r>
               <w:rPr>
                 <w:rFonts w:ascii="Times New Roman" w:hAnsi="Times New Roman" w:eastAsia="Times New Roman"/>
@@ -6951,19 +5202,8 @@
         <w:tc>
           <w:tcPr>
             <w:tcW w:type="dxa" w:w="1872"/>
-            <w:tcBorders>
-              <w:top w:val="nil" w:sz="4" w:space="0" w:color="000000"/>
-              <w:left w:val="nil" w:sz="4" w:space="0" w:color="000000"/>
-              <w:bottom w:val="single" w:sz="4" w:space="0" w:color="000000"/>
-              <w:right w:val="nil" w:sz="4" w:space="0" w:color="000000"/>
-              <w:insideH w:val="nil" w:sz="4" w:space="0" w:color="000000"/>
-              <w:insideV w:val="nil" w:sz="4" w:space="0" w:color="000000"/>
-            </w:tcBorders>
           </w:tcPr>
           <w:p>
-            <w:pPr>
-              <w:jc w:val="left"/>
-            </w:pPr>
             <w:r>
               <w:rPr>
                 <w:rFonts w:ascii="Times New Roman" w:hAnsi="Times New Roman" w:eastAsia="Times New Roman"/>
@@ -6977,19 +5217,8 @@
         <w:tc>
           <w:tcPr>
             <w:tcW w:type="dxa" w:w="1872"/>
-            <w:tcBorders>
-              <w:top w:val="nil" w:sz="4" w:space="0" w:color="000000"/>
-              <w:left w:val="nil" w:sz="4" w:space="0" w:color="000000"/>
-              <w:bottom w:val="single" w:sz="4" w:space="0" w:color="000000"/>
-              <w:right w:val="nil" w:sz="4" w:space="0" w:color="000000"/>
-              <w:insideH w:val="nil" w:sz="4" w:space="0" w:color="000000"/>
-              <w:insideV w:val="nil" w:sz="4" w:space="0" w:color="000000"/>
-            </w:tcBorders>
           </w:tcPr>
           <w:p>
-            <w:pPr>
-              <w:jc w:val="right"/>
-            </w:pPr>
             <w:r>
               <w:rPr>
                 <w:rFonts w:ascii="Times New Roman" w:hAnsi="Times New Roman" w:eastAsia="Times New Roman"/>
@@ -7003,19 +5232,8 @@
         <w:tc>
           <w:tcPr>
             <w:tcW w:type="dxa" w:w="1872"/>
-            <w:tcBorders>
-              <w:top w:val="nil" w:sz="4" w:space="0" w:color="000000"/>
-              <w:left w:val="nil" w:sz="4" w:space="0" w:color="000000"/>
-              <w:bottom w:val="single" w:sz="4" w:space="0" w:color="000000"/>
-              <w:right w:val="nil" w:sz="4" w:space="0" w:color="000000"/>
-              <w:insideH w:val="nil" w:sz="4" w:space="0" w:color="000000"/>
-              <w:insideV w:val="nil" w:sz="4" w:space="0" w:color="000000"/>
-            </w:tcBorders>
           </w:tcPr>
           <w:p>
-            <w:pPr>
-              <w:jc w:val="right"/>
-            </w:pPr>
             <w:r>
               <w:rPr>
                 <w:rFonts w:ascii="Times New Roman" w:hAnsi="Times New Roman" w:eastAsia="Times New Roman"/>
@@ -7029,19 +5247,8 @@
         <w:tc>
           <w:tcPr>
             <w:tcW w:type="dxa" w:w="1872"/>
-            <w:tcBorders>
-              <w:top w:val="nil" w:sz="4" w:space="0" w:color="000000"/>
-              <w:left w:val="nil" w:sz="4" w:space="0" w:color="000000"/>
-              <w:bottom w:val="single" w:sz="4" w:space="0" w:color="000000"/>
-              <w:right w:val="nil" w:sz="4" w:space="0" w:color="000000"/>
-              <w:insideH w:val="nil" w:sz="4" w:space="0" w:color="000000"/>
-              <w:insideV w:val="nil" w:sz="4" w:space="0" w:color="000000"/>
-            </w:tcBorders>
           </w:tcPr>
           <w:p>
-            <w:pPr>
-              <w:jc w:val="left"/>
-            </w:pPr>
             <w:r>
               <w:rPr>
                 <w:rFonts w:ascii="Times New Roman" w:hAnsi="Times New Roman" w:eastAsia="Times New Roman"/>
@@ -7122,19 +5329,8 @@
         <w:tc>
           <w:tcPr>
             <w:tcW w:type="dxa" w:w="2340"/>
-            <w:tcBorders>
-              <w:top w:val="single" w:sz="4" w:space="0" w:color="000000"/>
-              <w:left w:val="nil" w:sz="4" w:space="0" w:color="000000"/>
-              <w:bottom w:val="single" w:sz="4" w:space="0" w:color="000000"/>
-              <w:right w:val="nil" w:sz="4" w:space="0" w:color="000000"/>
-              <w:insideH w:val="nil" w:sz="4" w:space="0" w:color="000000"/>
-              <w:insideV w:val="nil" w:sz="4" w:space="0" w:color="000000"/>
-            </w:tcBorders>
           </w:tcPr>
           <w:p>
-            <w:pPr>
-              <w:jc w:val="center"/>
-            </w:pPr>
             <w:r>
               <w:rPr>
                 <w:rFonts w:ascii="Times New Roman" w:hAnsi="Times New Roman" w:eastAsia="Times New Roman"/>
@@ -7148,19 +5344,8 @@
         <w:tc>
           <w:tcPr>
             <w:tcW w:type="dxa" w:w="2340"/>
-            <w:tcBorders>
-              <w:top w:val="single" w:sz="4" w:space="0" w:color="000000"/>
-              <w:left w:val="nil" w:sz="4" w:space="0" w:color="000000"/>
-              <w:bottom w:val="single" w:sz="4" w:space="0" w:color="000000"/>
-              <w:right w:val="nil" w:sz="4" w:space="0" w:color="000000"/>
-              <w:insideH w:val="nil" w:sz="4" w:space="0" w:color="000000"/>
-              <w:insideV w:val="nil" w:sz="4" w:space="0" w:color="000000"/>
-            </w:tcBorders>
           </w:tcPr>
           <w:p>
-            <w:pPr>
-              <w:jc w:val="center"/>
-            </w:pPr>
             <w:r>
               <w:rPr>
                 <w:rFonts w:ascii="Times New Roman" w:hAnsi="Times New Roman" w:eastAsia="Times New Roman"/>
@@ -7174,19 +5359,8 @@
         <w:tc>
           <w:tcPr>
             <w:tcW w:type="dxa" w:w="2340"/>
-            <w:tcBorders>
-              <w:top w:val="single" w:sz="4" w:space="0" w:color="000000"/>
-              <w:left w:val="nil" w:sz="4" w:space="0" w:color="000000"/>
-              <w:bottom w:val="single" w:sz="4" w:space="0" w:color="000000"/>
-              <w:right w:val="nil" w:sz="4" w:space="0" w:color="000000"/>
-              <w:insideH w:val="nil" w:sz="4" w:space="0" w:color="000000"/>
-              <w:insideV w:val="nil" w:sz="4" w:space="0" w:color="000000"/>
-            </w:tcBorders>
           </w:tcPr>
           <w:p>
-            <w:pPr>
-              <w:jc w:val="center"/>
-            </w:pPr>
             <w:r>
               <w:rPr>
                 <w:rFonts w:ascii="Times New Roman" w:hAnsi="Times New Roman" w:eastAsia="Times New Roman"/>
@@ -7200,19 +5374,8 @@
         <w:tc>
           <w:tcPr>
             <w:tcW w:type="dxa" w:w="2340"/>
-            <w:tcBorders>
-              <w:top w:val="single" w:sz="4" w:space="0" w:color="000000"/>
-              <w:left w:val="nil" w:sz="4" w:space="0" w:color="000000"/>
-              <w:bottom w:val="single" w:sz="4" w:space="0" w:color="000000"/>
-              <w:right w:val="nil" w:sz="4" w:space="0" w:color="000000"/>
-              <w:insideH w:val="nil" w:sz="4" w:space="0" w:color="000000"/>
-              <w:insideV w:val="nil" w:sz="4" w:space="0" w:color="000000"/>
-            </w:tcBorders>
           </w:tcPr>
           <w:p>
-            <w:pPr>
-              <w:jc w:val="center"/>
-            </w:pPr>
             <w:r>
               <w:rPr>
                 <w:rFonts w:ascii="Times New Roman" w:hAnsi="Times New Roman" w:eastAsia="Times New Roman"/>
@@ -7228,19 +5391,8 @@
         <w:tc>
           <w:tcPr>
             <w:tcW w:type="dxa" w:w="2340"/>
-            <w:tcBorders>
-              <w:top w:val="nil" w:sz="4" w:space="0" w:color="000000"/>
-              <w:left w:val="nil" w:sz="4" w:space="0" w:color="000000"/>
-              <w:bottom w:val="nil" w:sz="4" w:space="0" w:color="000000"/>
-              <w:right w:val="nil" w:sz="4" w:space="0" w:color="000000"/>
-              <w:insideH w:val="nil" w:sz="4" w:space="0" w:color="000000"/>
-              <w:insideV w:val="nil" w:sz="4" w:space="0" w:color="000000"/>
-            </w:tcBorders>
           </w:tcPr>
           <w:p>
-            <w:pPr>
-              <w:jc w:val="left"/>
-            </w:pPr>
             <w:r>
               <w:rPr>
                 <w:rFonts w:ascii="Times New Roman" w:hAnsi="Times New Roman" w:eastAsia="Times New Roman"/>
@@ -7254,19 +5406,8 @@
         <w:tc>
           <w:tcPr>
             <w:tcW w:type="dxa" w:w="2340"/>
-            <w:tcBorders>
-              <w:top w:val="nil" w:sz="4" w:space="0" w:color="000000"/>
-              <w:left w:val="nil" w:sz="4" w:space="0" w:color="000000"/>
-              <w:bottom w:val="nil" w:sz="4" w:space="0" w:color="000000"/>
-              <w:right w:val="nil" w:sz="4" w:space="0" w:color="000000"/>
-              <w:insideH w:val="nil" w:sz="4" w:space="0" w:color="000000"/>
-              <w:insideV w:val="nil" w:sz="4" w:space="0" w:color="000000"/>
-            </w:tcBorders>
           </w:tcPr>
           <w:p>
-            <w:pPr>
-              <w:jc w:val="left"/>
-            </w:pPr>
             <w:r>
               <w:rPr>
                 <w:rFonts w:ascii="Times New Roman" w:hAnsi="Times New Roman" w:eastAsia="Times New Roman"/>
@@ -7280,19 +5421,8 @@
         <w:tc>
           <w:tcPr>
             <w:tcW w:type="dxa" w:w="2340"/>
-            <w:tcBorders>
-              <w:top w:val="nil" w:sz="4" w:space="0" w:color="000000"/>
-              <w:left w:val="nil" w:sz="4" w:space="0" w:color="000000"/>
-              <w:bottom w:val="nil" w:sz="4" w:space="0" w:color="000000"/>
-              <w:right w:val="nil" w:sz="4" w:space="0" w:color="000000"/>
-              <w:insideH w:val="nil" w:sz="4" w:space="0" w:color="000000"/>
-              <w:insideV w:val="nil" w:sz="4" w:space="0" w:color="000000"/>
-            </w:tcBorders>
           </w:tcPr>
           <w:p>
-            <w:pPr>
-              <w:jc w:val="left"/>
-            </w:pPr>
             <w:r>
               <w:rPr>
                 <w:rFonts w:ascii="Times New Roman" w:hAnsi="Times New Roman" w:eastAsia="Times New Roman"/>
@@ -7306,19 +5436,8 @@
         <w:tc>
           <w:tcPr>
             <w:tcW w:type="dxa" w:w="2340"/>
-            <w:tcBorders>
-              <w:top w:val="nil" w:sz="4" w:space="0" w:color="000000"/>
-              <w:left w:val="nil" w:sz="4" w:space="0" w:color="000000"/>
-              <w:bottom w:val="nil" w:sz="4" w:space="0" w:color="000000"/>
-              <w:right w:val="nil" w:sz="4" w:space="0" w:color="000000"/>
-              <w:insideH w:val="nil" w:sz="4" w:space="0" w:color="000000"/>
-              <w:insideV w:val="nil" w:sz="4" w:space="0" w:color="000000"/>
-            </w:tcBorders>
           </w:tcPr>
           <w:p>
-            <w:pPr>
-              <w:jc w:val="left"/>
-            </w:pPr>
             <w:r>
               <w:rPr>
                 <w:rFonts w:ascii="Times New Roman" w:hAnsi="Times New Roman" w:eastAsia="Times New Roman"/>
@@ -7334,19 +5453,8 @@
         <w:tc>
           <w:tcPr>
             <w:tcW w:type="dxa" w:w="2340"/>
-            <w:tcBorders>
-              <w:top w:val="nil" w:sz="4" w:space="0" w:color="000000"/>
-              <w:left w:val="nil" w:sz="4" w:space="0" w:color="000000"/>
-              <w:bottom w:val="nil" w:sz="4" w:space="0" w:color="000000"/>
-              <w:right w:val="nil" w:sz="4" w:space="0" w:color="000000"/>
-              <w:insideH w:val="nil" w:sz="4" w:space="0" w:color="000000"/>
-              <w:insideV w:val="nil" w:sz="4" w:space="0" w:color="000000"/>
-            </w:tcBorders>
           </w:tcPr>
           <w:p>
-            <w:pPr>
-              <w:jc w:val="left"/>
-            </w:pPr>
             <w:r>
               <w:rPr>
                 <w:rFonts w:ascii="Times New Roman" w:hAnsi="Times New Roman" w:eastAsia="Times New Roman"/>
@@ -7360,19 +5468,8 @@
         <w:tc>
           <w:tcPr>
             <w:tcW w:type="dxa" w:w="2340"/>
-            <w:tcBorders>
-              <w:top w:val="nil" w:sz="4" w:space="0" w:color="000000"/>
-              <w:left w:val="nil" w:sz="4" w:space="0" w:color="000000"/>
-              <w:bottom w:val="nil" w:sz="4" w:space="0" w:color="000000"/>
-              <w:right w:val="nil" w:sz="4" w:space="0" w:color="000000"/>
-              <w:insideH w:val="nil" w:sz="4" w:space="0" w:color="000000"/>
-              <w:insideV w:val="nil" w:sz="4" w:space="0" w:color="000000"/>
-            </w:tcBorders>
           </w:tcPr>
           <w:p>
-            <w:pPr>
-              <w:jc w:val="left"/>
-            </w:pPr>
             <w:r>
               <w:rPr>
                 <w:rFonts w:ascii="Times New Roman" w:hAnsi="Times New Roman" w:eastAsia="Times New Roman"/>
@@ -7386,19 +5483,8 @@
         <w:tc>
           <w:tcPr>
             <w:tcW w:type="dxa" w:w="2340"/>
-            <w:tcBorders>
-              <w:top w:val="nil" w:sz="4" w:space="0" w:color="000000"/>
-              <w:left w:val="nil" w:sz="4" w:space="0" w:color="000000"/>
-              <w:bottom w:val="nil" w:sz="4" w:space="0" w:color="000000"/>
-              <w:right w:val="nil" w:sz="4" w:space="0" w:color="000000"/>
-              <w:insideH w:val="nil" w:sz="4" w:space="0" w:color="000000"/>
-              <w:insideV w:val="nil" w:sz="4" w:space="0" w:color="000000"/>
-            </w:tcBorders>
           </w:tcPr>
           <w:p>
-            <w:pPr>
-              <w:jc w:val="left"/>
-            </w:pPr>
             <w:r>
               <w:rPr>
                 <w:rFonts w:ascii="Times New Roman" w:hAnsi="Times New Roman" w:eastAsia="Times New Roman"/>
@@ -7412,19 +5498,8 @@
         <w:tc>
           <w:tcPr>
             <w:tcW w:type="dxa" w:w="2340"/>
-            <w:tcBorders>
-              <w:top w:val="nil" w:sz="4" w:space="0" w:color="000000"/>
-              <w:left w:val="nil" w:sz="4" w:space="0" w:color="000000"/>
-              <w:bottom w:val="nil" w:sz="4" w:space="0" w:color="000000"/>
-              <w:right w:val="nil" w:sz="4" w:space="0" w:color="000000"/>
-              <w:insideH w:val="nil" w:sz="4" w:space="0" w:color="000000"/>
-              <w:insideV w:val="nil" w:sz="4" w:space="0" w:color="000000"/>
-            </w:tcBorders>
           </w:tcPr>
           <w:p>
-            <w:pPr>
-              <w:jc w:val="left"/>
-            </w:pPr>
             <w:r>
               <w:rPr>
                 <w:rFonts w:ascii="Times New Roman" w:hAnsi="Times New Roman" w:eastAsia="Times New Roman"/>
@@ -7440,19 +5515,8 @@
         <w:tc>
           <w:tcPr>
             <w:tcW w:type="dxa" w:w="2340"/>
-            <w:tcBorders>
-              <w:top w:val="nil" w:sz="4" w:space="0" w:color="000000"/>
-              <w:left w:val="nil" w:sz="4" w:space="0" w:color="000000"/>
-              <w:bottom w:val="nil" w:sz="4" w:space="0" w:color="000000"/>
-              <w:right w:val="nil" w:sz="4" w:space="0" w:color="000000"/>
-              <w:insideH w:val="nil" w:sz="4" w:space="0" w:color="000000"/>
-              <w:insideV w:val="nil" w:sz="4" w:space="0" w:color="000000"/>
-            </w:tcBorders>
           </w:tcPr>
           <w:p>
-            <w:pPr>
-              <w:jc w:val="left"/>
-            </w:pPr>
             <w:r>
               <w:rPr>
                 <w:rFonts w:ascii="Times New Roman" w:hAnsi="Times New Roman" w:eastAsia="Times New Roman"/>
@@ -7466,19 +5530,8 @@
         <w:tc>
           <w:tcPr>
             <w:tcW w:type="dxa" w:w="2340"/>
-            <w:tcBorders>
-              <w:top w:val="nil" w:sz="4" w:space="0" w:color="000000"/>
-              <w:left w:val="nil" w:sz="4" w:space="0" w:color="000000"/>
-              <w:bottom w:val="nil" w:sz="4" w:space="0" w:color="000000"/>
-              <w:right w:val="nil" w:sz="4" w:space="0" w:color="000000"/>
-              <w:insideH w:val="nil" w:sz="4" w:space="0" w:color="000000"/>
-              <w:insideV w:val="nil" w:sz="4" w:space="0" w:color="000000"/>
-            </w:tcBorders>
           </w:tcPr>
           <w:p>
-            <w:pPr>
-              <w:jc w:val="left"/>
-            </w:pPr>
             <w:r>
               <w:rPr>
                 <w:rFonts w:ascii="Times New Roman" w:hAnsi="Times New Roman" w:eastAsia="Times New Roman"/>
@@ -7492,19 +5545,8 @@
         <w:tc>
           <w:tcPr>
             <w:tcW w:type="dxa" w:w="2340"/>
-            <w:tcBorders>
-              <w:top w:val="nil" w:sz="4" w:space="0" w:color="000000"/>
-              <w:left w:val="nil" w:sz="4" w:space="0" w:color="000000"/>
-              <w:bottom w:val="nil" w:sz="4" w:space="0" w:color="000000"/>
-              <w:right w:val="nil" w:sz="4" w:space="0" w:color="000000"/>
-              <w:insideH w:val="nil" w:sz="4" w:space="0" w:color="000000"/>
-              <w:insideV w:val="nil" w:sz="4" w:space="0" w:color="000000"/>
-            </w:tcBorders>
           </w:tcPr>
           <w:p>
-            <w:pPr>
-              <w:jc w:val="left"/>
-            </w:pPr>
             <w:r>
               <w:rPr>
                 <w:rFonts w:ascii="Times New Roman" w:hAnsi="Times New Roman" w:eastAsia="Times New Roman"/>
@@ -7518,19 +5560,8 @@
         <w:tc>
           <w:tcPr>
             <w:tcW w:type="dxa" w:w="2340"/>
-            <w:tcBorders>
-              <w:top w:val="nil" w:sz="4" w:space="0" w:color="000000"/>
-              <w:left w:val="nil" w:sz="4" w:space="0" w:color="000000"/>
-              <w:bottom w:val="nil" w:sz="4" w:space="0" w:color="000000"/>
-              <w:right w:val="nil" w:sz="4" w:space="0" w:color="000000"/>
-              <w:insideH w:val="nil" w:sz="4" w:space="0" w:color="000000"/>
-              <w:insideV w:val="nil" w:sz="4" w:space="0" w:color="000000"/>
-            </w:tcBorders>
           </w:tcPr>
           <w:p>
-            <w:pPr>
-              <w:jc w:val="left"/>
-            </w:pPr>
             <w:r>
               <w:rPr>
                 <w:rFonts w:ascii="Times New Roman" w:hAnsi="Times New Roman" w:eastAsia="Times New Roman"/>
@@ -7546,19 +5577,8 @@
         <w:tc>
           <w:tcPr>
             <w:tcW w:type="dxa" w:w="2340"/>
-            <w:tcBorders>
-              <w:top w:val="nil" w:sz="4" w:space="0" w:color="000000"/>
-              <w:left w:val="nil" w:sz="4" w:space="0" w:color="000000"/>
-              <w:bottom w:val="nil" w:sz="4" w:space="0" w:color="000000"/>
-              <w:right w:val="nil" w:sz="4" w:space="0" w:color="000000"/>
-              <w:insideH w:val="nil" w:sz="4" w:space="0" w:color="000000"/>
-              <w:insideV w:val="nil" w:sz="4" w:space="0" w:color="000000"/>
-            </w:tcBorders>
           </w:tcPr>
           <w:p>
-            <w:pPr>
-              <w:jc w:val="left"/>
-            </w:pPr>
             <w:r>
               <w:rPr>
                 <w:rFonts w:ascii="Times New Roman" w:hAnsi="Times New Roman" w:eastAsia="Times New Roman"/>
@@ -7572,19 +5592,8 @@
         <w:tc>
           <w:tcPr>
             <w:tcW w:type="dxa" w:w="2340"/>
-            <w:tcBorders>
-              <w:top w:val="nil" w:sz="4" w:space="0" w:color="000000"/>
-              <w:left w:val="nil" w:sz="4" w:space="0" w:color="000000"/>
-              <w:bottom w:val="nil" w:sz="4" w:space="0" w:color="000000"/>
-              <w:right w:val="nil" w:sz="4" w:space="0" w:color="000000"/>
-              <w:insideH w:val="nil" w:sz="4" w:space="0" w:color="000000"/>
-              <w:insideV w:val="nil" w:sz="4" w:space="0" w:color="000000"/>
-            </w:tcBorders>
           </w:tcPr>
           <w:p>
-            <w:pPr>
-              <w:jc w:val="left"/>
-            </w:pPr>
             <w:r>
               <w:rPr>
                 <w:rFonts w:ascii="Times New Roman" w:hAnsi="Times New Roman" w:eastAsia="Times New Roman"/>
@@ -7598,19 +5607,8 @@
         <w:tc>
           <w:tcPr>
             <w:tcW w:type="dxa" w:w="2340"/>
-            <w:tcBorders>
-              <w:top w:val="nil" w:sz="4" w:space="0" w:color="000000"/>
-              <w:left w:val="nil" w:sz="4" w:space="0" w:color="000000"/>
-              <w:bottom w:val="nil" w:sz="4" w:space="0" w:color="000000"/>
-              <w:right w:val="nil" w:sz="4" w:space="0" w:color="000000"/>
-              <w:insideH w:val="nil" w:sz="4" w:space="0" w:color="000000"/>
-              <w:insideV w:val="nil" w:sz="4" w:space="0" w:color="000000"/>
-            </w:tcBorders>
           </w:tcPr>
           <w:p>
-            <w:pPr>
-              <w:jc w:val="left"/>
-            </w:pPr>
             <w:r>
               <w:rPr>
                 <w:rFonts w:ascii="Times New Roman" w:hAnsi="Times New Roman" w:eastAsia="Times New Roman"/>
@@ -7624,19 +5622,8 @@
         <w:tc>
           <w:tcPr>
             <w:tcW w:type="dxa" w:w="2340"/>
-            <w:tcBorders>
-              <w:top w:val="nil" w:sz="4" w:space="0" w:color="000000"/>
-              <w:left w:val="nil" w:sz="4" w:space="0" w:color="000000"/>
-              <w:bottom w:val="nil" w:sz="4" w:space="0" w:color="000000"/>
-              <w:right w:val="nil" w:sz="4" w:space="0" w:color="000000"/>
-              <w:insideH w:val="nil" w:sz="4" w:space="0" w:color="000000"/>
-              <w:insideV w:val="nil" w:sz="4" w:space="0" w:color="000000"/>
-            </w:tcBorders>
           </w:tcPr>
           <w:p>
-            <w:pPr>
-              <w:jc w:val="left"/>
-            </w:pPr>
             <w:r>
               <w:rPr>
                 <w:rFonts w:ascii="Times New Roman" w:hAnsi="Times New Roman" w:eastAsia="Times New Roman"/>
@@ -7652,19 +5639,8 @@
         <w:tc>
           <w:tcPr>
             <w:tcW w:type="dxa" w:w="2340"/>
-            <w:tcBorders>
-              <w:top w:val="nil" w:sz="4" w:space="0" w:color="000000"/>
-              <w:left w:val="nil" w:sz="4" w:space="0" w:color="000000"/>
-              <w:bottom w:val="nil" w:sz="4" w:space="0" w:color="000000"/>
-              <w:right w:val="nil" w:sz="4" w:space="0" w:color="000000"/>
-              <w:insideH w:val="nil" w:sz="4" w:space="0" w:color="000000"/>
-              <w:insideV w:val="nil" w:sz="4" w:space="0" w:color="000000"/>
-            </w:tcBorders>
           </w:tcPr>
           <w:p>
-            <w:pPr>
-              <w:jc w:val="left"/>
-            </w:pPr>
             <w:r>
               <w:rPr>
                 <w:rFonts w:ascii="Times New Roman" w:hAnsi="Times New Roman" w:eastAsia="Times New Roman"/>
@@ -7678,19 +5654,8 @@
         <w:tc>
           <w:tcPr>
             <w:tcW w:type="dxa" w:w="2340"/>
-            <w:tcBorders>
-              <w:top w:val="nil" w:sz="4" w:space="0" w:color="000000"/>
-              <w:left w:val="nil" w:sz="4" w:space="0" w:color="000000"/>
-              <w:bottom w:val="nil" w:sz="4" w:space="0" w:color="000000"/>
-              <w:right w:val="nil" w:sz="4" w:space="0" w:color="000000"/>
-              <w:insideH w:val="nil" w:sz="4" w:space="0" w:color="000000"/>
-              <w:insideV w:val="nil" w:sz="4" w:space="0" w:color="000000"/>
-            </w:tcBorders>
           </w:tcPr>
           <w:p>
-            <w:pPr>
-              <w:jc w:val="left"/>
-            </w:pPr>
             <w:r>
               <w:rPr>
                 <w:rFonts w:ascii="Times New Roman" w:hAnsi="Times New Roman" w:eastAsia="Times New Roman"/>
@@ -7704,19 +5669,8 @@
         <w:tc>
           <w:tcPr>
             <w:tcW w:type="dxa" w:w="2340"/>
-            <w:tcBorders>
-              <w:top w:val="nil" w:sz="4" w:space="0" w:color="000000"/>
-              <w:left w:val="nil" w:sz="4" w:space="0" w:color="000000"/>
-              <w:bottom w:val="nil" w:sz="4" w:space="0" w:color="000000"/>
-              <w:right w:val="nil" w:sz="4" w:space="0" w:color="000000"/>
-              <w:insideH w:val="nil" w:sz="4" w:space="0" w:color="000000"/>
-              <w:insideV w:val="nil" w:sz="4" w:space="0" w:color="000000"/>
-            </w:tcBorders>
           </w:tcPr>
           <w:p>
-            <w:pPr>
-              <w:jc w:val="left"/>
-            </w:pPr>
             <w:r>
               <w:rPr>
                 <w:rFonts w:ascii="Times New Roman" w:hAnsi="Times New Roman" w:eastAsia="Times New Roman"/>
@@ -7730,19 +5684,8 @@
         <w:tc>
           <w:tcPr>
             <w:tcW w:type="dxa" w:w="2340"/>
-            <w:tcBorders>
-              <w:top w:val="nil" w:sz="4" w:space="0" w:color="000000"/>
-              <w:left w:val="nil" w:sz="4" w:space="0" w:color="000000"/>
-              <w:bottom w:val="nil" w:sz="4" w:space="0" w:color="000000"/>
-              <w:right w:val="nil" w:sz="4" w:space="0" w:color="000000"/>
-              <w:insideH w:val="nil" w:sz="4" w:space="0" w:color="000000"/>
-              <w:insideV w:val="nil" w:sz="4" w:space="0" w:color="000000"/>
-            </w:tcBorders>
           </w:tcPr>
           <w:p>
-            <w:pPr>
-              <w:jc w:val="left"/>
-            </w:pPr>
             <w:r>
               <w:rPr>
                 <w:rFonts w:ascii="Times New Roman" w:hAnsi="Times New Roman" w:eastAsia="Times New Roman"/>
@@ -7758,19 +5701,8 @@
         <w:tc>
           <w:tcPr>
             <w:tcW w:type="dxa" w:w="2340"/>
-            <w:tcBorders>
-              <w:top w:val="nil" w:sz="4" w:space="0" w:color="000000"/>
-              <w:left w:val="nil" w:sz="4" w:space="0" w:color="000000"/>
-              <w:bottom w:val="nil" w:sz="4" w:space="0" w:color="000000"/>
-              <w:right w:val="nil" w:sz="4" w:space="0" w:color="000000"/>
-              <w:insideH w:val="nil" w:sz="4" w:space="0" w:color="000000"/>
-              <w:insideV w:val="nil" w:sz="4" w:space="0" w:color="000000"/>
-            </w:tcBorders>
           </w:tcPr>
           <w:p>
-            <w:pPr>
-              <w:jc w:val="left"/>
-            </w:pPr>
             <w:r>
               <w:rPr>
                 <w:rFonts w:ascii="Times New Roman" w:hAnsi="Times New Roman" w:eastAsia="Times New Roman"/>
@@ -7784,19 +5716,8 @@
         <w:tc>
           <w:tcPr>
             <w:tcW w:type="dxa" w:w="2340"/>
-            <w:tcBorders>
-              <w:top w:val="nil" w:sz="4" w:space="0" w:color="000000"/>
-              <w:left w:val="nil" w:sz="4" w:space="0" w:color="000000"/>
-              <w:bottom w:val="nil" w:sz="4" w:space="0" w:color="000000"/>
-              <w:right w:val="nil" w:sz="4" w:space="0" w:color="000000"/>
-              <w:insideH w:val="nil" w:sz="4" w:space="0" w:color="000000"/>
-              <w:insideV w:val="nil" w:sz="4" w:space="0" w:color="000000"/>
-            </w:tcBorders>
           </w:tcPr>
           <w:p>
-            <w:pPr>
-              <w:jc w:val="left"/>
-            </w:pPr>
             <w:r>
               <w:rPr>
                 <w:rFonts w:ascii="Times New Roman" w:hAnsi="Times New Roman" w:eastAsia="Times New Roman"/>
@@ -7810,19 +5731,8 @@
         <w:tc>
           <w:tcPr>
             <w:tcW w:type="dxa" w:w="2340"/>
-            <w:tcBorders>
-              <w:top w:val="nil" w:sz="4" w:space="0" w:color="000000"/>
-              <w:left w:val="nil" w:sz="4" w:space="0" w:color="000000"/>
-              <w:bottom w:val="nil" w:sz="4" w:space="0" w:color="000000"/>
-              <w:right w:val="nil" w:sz="4" w:space="0" w:color="000000"/>
-              <w:insideH w:val="nil" w:sz="4" w:space="0" w:color="000000"/>
-              <w:insideV w:val="nil" w:sz="4" w:space="0" w:color="000000"/>
-            </w:tcBorders>
           </w:tcPr>
           <w:p>
-            <w:pPr>
-              <w:jc w:val="left"/>
-            </w:pPr>
             <w:r>
               <w:rPr>
                 <w:rFonts w:ascii="Times New Roman" w:hAnsi="Times New Roman" w:eastAsia="Times New Roman"/>
@@ -7836,19 +5746,8 @@
         <w:tc>
           <w:tcPr>
             <w:tcW w:type="dxa" w:w="2340"/>
-            <w:tcBorders>
-              <w:top w:val="nil" w:sz="4" w:space="0" w:color="000000"/>
-              <w:left w:val="nil" w:sz="4" w:space="0" w:color="000000"/>
-              <w:bottom w:val="nil" w:sz="4" w:space="0" w:color="000000"/>
-              <w:right w:val="nil" w:sz="4" w:space="0" w:color="000000"/>
-              <w:insideH w:val="nil" w:sz="4" w:space="0" w:color="000000"/>
-              <w:insideV w:val="nil" w:sz="4" w:space="0" w:color="000000"/>
-            </w:tcBorders>
           </w:tcPr>
           <w:p>
-            <w:pPr>
-              <w:jc w:val="left"/>
-            </w:pPr>
             <w:r>
               <w:rPr>
                 <w:rFonts w:ascii="Times New Roman" w:hAnsi="Times New Roman" w:eastAsia="Times New Roman"/>
@@ -7864,19 +5763,8 @@
         <w:tc>
           <w:tcPr>
             <w:tcW w:type="dxa" w:w="2340"/>
-            <w:tcBorders>
-              <w:top w:val="nil" w:sz="4" w:space="0" w:color="000000"/>
-              <w:left w:val="nil" w:sz="4" w:space="0" w:color="000000"/>
-              <w:bottom w:val="single" w:sz="4" w:space="0" w:color="000000"/>
-              <w:right w:val="nil" w:sz="4" w:space="0" w:color="000000"/>
-              <w:insideH w:val="nil" w:sz="4" w:space="0" w:color="000000"/>
-              <w:insideV w:val="nil" w:sz="4" w:space="0" w:color="000000"/>
-            </w:tcBorders>
           </w:tcPr>
           <w:p>
-            <w:pPr>
-              <w:jc w:val="left"/>
-            </w:pPr>
             <w:r>
               <w:rPr>
                 <w:rFonts w:ascii="Times New Roman" w:hAnsi="Times New Roman" w:eastAsia="Times New Roman"/>
@@ -7890,19 +5778,8 @@
         <w:tc>
           <w:tcPr>
             <w:tcW w:type="dxa" w:w="2340"/>
-            <w:tcBorders>
-              <w:top w:val="nil" w:sz="4" w:space="0" w:color="000000"/>
-              <w:left w:val="nil" w:sz="4" w:space="0" w:color="000000"/>
-              <w:bottom w:val="single" w:sz="4" w:space="0" w:color="000000"/>
-              <w:right w:val="nil" w:sz="4" w:space="0" w:color="000000"/>
-              <w:insideH w:val="nil" w:sz="4" w:space="0" w:color="000000"/>
-              <w:insideV w:val="nil" w:sz="4" w:space="0" w:color="000000"/>
-            </w:tcBorders>
           </w:tcPr>
           <w:p>
-            <w:pPr>
-              <w:jc w:val="left"/>
-            </w:pPr>
             <w:r>
               <w:rPr>
                 <w:rFonts w:ascii="Times New Roman" w:hAnsi="Times New Roman" w:eastAsia="Times New Roman"/>
@@ -7916,19 +5793,8 @@
         <w:tc>
           <w:tcPr>
             <w:tcW w:type="dxa" w:w="2340"/>
-            <w:tcBorders>
-              <w:top w:val="nil" w:sz="4" w:space="0" w:color="000000"/>
-              <w:left w:val="nil" w:sz="4" w:space="0" w:color="000000"/>
-              <w:bottom w:val="single" w:sz="4" w:space="0" w:color="000000"/>
-              <w:right w:val="nil" w:sz="4" w:space="0" w:color="000000"/>
-              <w:insideH w:val="nil" w:sz="4" w:space="0" w:color="000000"/>
-              <w:insideV w:val="nil" w:sz="4" w:space="0" w:color="000000"/>
-            </w:tcBorders>
           </w:tcPr>
           <w:p>
-            <w:pPr>
-              <w:jc w:val="left"/>
-            </w:pPr>
             <w:r>
               <w:rPr>
                 <w:rFonts w:ascii="Times New Roman" w:hAnsi="Times New Roman" w:eastAsia="Times New Roman"/>
@@ -7942,19 +5808,8 @@
         <w:tc>
           <w:tcPr>
             <w:tcW w:type="dxa" w:w="2340"/>
-            <w:tcBorders>
-              <w:top w:val="nil" w:sz="4" w:space="0" w:color="000000"/>
-              <w:left w:val="nil" w:sz="4" w:space="0" w:color="000000"/>
-              <w:bottom w:val="single" w:sz="4" w:space="0" w:color="000000"/>
-              <w:right w:val="nil" w:sz="4" w:space="0" w:color="000000"/>
-              <w:insideH w:val="nil" w:sz="4" w:space="0" w:color="000000"/>
-              <w:insideV w:val="nil" w:sz="4" w:space="0" w:color="000000"/>
-            </w:tcBorders>
           </w:tcPr>
           <w:p>
-            <w:pPr>
-              <w:jc w:val="left"/>
-            </w:pPr>
             <w:r>
               <w:rPr>
                 <w:rFonts w:ascii="Times New Roman" w:hAnsi="Times New Roman" w:eastAsia="Times New Roman"/>

</xml_diff>